<commit_message>
Report: illustrate how the market data was collected for free
Adds sections 6.4-6.7 to the fintech test report: the two kinds of
Apollo calls (search vs unlock), the exact request used per market,
the measured pools as a log-scale chart, the pipeline with free/paid
stages marked, and a bracketed credit test (10 searches, 1,000 people
viewed, counter change 0 with 120 s idle windows on both sides) as a
table and a timeline chart. Also a cost table for every Apollo call
measured today. Charts and the raw test result are in docs/evidence.

Co-Authored-By: Claude Fable 5.1 <noreply@anthropic.com>
</commit_message>
<xml_diff>
--- a/docs/Lead-Search-Test-Report-Fintech-Founders.docx
+++ b/docs/Lead-Search-Test-Report-Fintech-Founders.docx
@@ -456,14 +456,15 @@
         </w:p>
         <w:p>
           <w:pPr>
-            <w:pStyle w:val="TOC1"/>
+            <w:pStyle w:val="TOC2"/>
             <w:tabs>
               <w:tab w:val="right" w:pos="10080" w:leader="dot"/>
             </w:tabs>
+            <w:ind w:left="220"/>
           </w:pPr>
           <w:hyperlink w:history="1" w:anchor="_Toc15">
             <w:r>
-              <w:t xml:space="preserve">7. Evidence from the run</w:t>
+              <w:t xml:space="preserve">6.4 How all of this data was collected, and what it cost</w:t>
             </w:r>
             <w:r>
               <w:tab/>
@@ -486,7 +487,7 @@
           </w:pPr>
           <w:hyperlink w:history="1" w:anchor="_Toc16">
             <w:r>
-              <w:t xml:space="preserve">7.1 Server log events</w:t>
+              <w:t xml:space="preserve">6.5 The exact method</w:t>
             </w:r>
             <w:r>
               <w:tab/>
@@ -509,7 +510,7 @@
           </w:pPr>
           <w:hyperlink w:history="1" w:anchor="_Toc17">
             <w:r>
-              <w:t xml:space="preserve">7.2 Credit measurement</w:t>
+              <w:t xml:space="preserve">6.6 Proof that search calls do not spend credits</w:t>
             </w:r>
             <w:r>
               <w:tab/>
@@ -532,7 +533,7 @@
           </w:pPr>
           <w:hyperlink w:history="1" w:anchor="_Toc18">
             <w:r>
-              <w:t xml:space="preserve">7.3 Independent audit call</w:t>
+              <w:t xml:space="preserve">6.7 What else was measured, for completeness</w:t>
             </w:r>
             <w:r>
               <w:tab/>
@@ -540,6 +541,28 @@
             <w:r>
               <w:fldChar w:fldCharType="begin" w:dirty="true"/>
               <w:instrText xml:space="preserve">PAGEREF _Toc18 \h</w:instrText>
+              <w:fldChar w:fldCharType="separate"/>
+              <w:fldChar w:fldCharType="end"/>
+            </w:r>
+          </w:hyperlink>
+        </w:p>
+        <w:p>
+          <w:pPr>
+            <w:pStyle w:val="TOC1"/>
+            <w:tabs>
+              <w:tab w:val="right" w:pos="10080" w:leader="dot"/>
+            </w:tabs>
+          </w:pPr>
+          <w:hyperlink w:history="1" w:anchor="_Toc19">
+            <w:r>
+              <w:t xml:space="preserve">7. Evidence from the run</w:t>
+            </w:r>
+            <w:r>
+              <w:tab/>
+            </w:r>
+            <w:r>
+              <w:fldChar w:fldCharType="begin" w:dirty="true"/>
+              <w:instrText xml:space="preserve">PAGEREF _Toc19 \h</w:instrText>
               <w:fldChar w:fldCharType="separate"/>
               <w:fldChar w:fldCharType="end"/>
             </w:r>
@@ -553,7 +576,76 @@
             </w:tabs>
             <w:ind w:left="220"/>
           </w:pPr>
-          <w:hyperlink w:history="1" w:anchor="_Toc19">
+          <w:hyperlink w:history="1" w:anchor="_Toc20">
+            <w:r>
+              <w:t xml:space="preserve">7.1 Server log events</w:t>
+            </w:r>
+            <w:r>
+              <w:tab/>
+            </w:r>
+            <w:r>
+              <w:fldChar w:fldCharType="begin" w:dirty="true"/>
+              <w:instrText xml:space="preserve">PAGEREF _Toc20 \h</w:instrText>
+              <w:fldChar w:fldCharType="separate"/>
+              <w:fldChar w:fldCharType="end"/>
+            </w:r>
+          </w:hyperlink>
+        </w:p>
+        <w:p>
+          <w:pPr>
+            <w:pStyle w:val="TOC2"/>
+            <w:tabs>
+              <w:tab w:val="right" w:pos="10080" w:leader="dot"/>
+            </w:tabs>
+            <w:ind w:left="220"/>
+          </w:pPr>
+          <w:hyperlink w:history="1" w:anchor="_Toc21">
+            <w:r>
+              <w:t xml:space="preserve">7.2 Credit measurement</w:t>
+            </w:r>
+            <w:r>
+              <w:tab/>
+            </w:r>
+            <w:r>
+              <w:fldChar w:fldCharType="begin" w:dirty="true"/>
+              <w:instrText xml:space="preserve">PAGEREF _Toc21 \h</w:instrText>
+              <w:fldChar w:fldCharType="separate"/>
+              <w:fldChar w:fldCharType="end"/>
+            </w:r>
+          </w:hyperlink>
+        </w:p>
+        <w:p>
+          <w:pPr>
+            <w:pStyle w:val="TOC2"/>
+            <w:tabs>
+              <w:tab w:val="right" w:pos="10080" w:leader="dot"/>
+            </w:tabs>
+            <w:ind w:left="220"/>
+          </w:pPr>
+          <w:hyperlink w:history="1" w:anchor="_Toc22">
+            <w:r>
+              <w:t xml:space="preserve">7.3 Independent audit call</w:t>
+            </w:r>
+            <w:r>
+              <w:tab/>
+            </w:r>
+            <w:r>
+              <w:fldChar w:fldCharType="begin" w:dirty="true"/>
+              <w:instrText xml:space="preserve">PAGEREF _Toc22 \h</w:instrText>
+              <w:fldChar w:fldCharType="separate"/>
+              <w:fldChar w:fldCharType="end"/>
+            </w:r>
+          </w:hyperlink>
+        </w:p>
+        <w:p>
+          <w:pPr>
+            <w:pStyle w:val="TOC2"/>
+            <w:tabs>
+              <w:tab w:val="right" w:pos="10080" w:leader="dot"/>
+            </w:tabs>
+            <w:ind w:left="220"/>
+          </w:pPr>
+          <w:hyperlink w:history="1" w:anchor="_Toc23">
             <w:r>
               <w:t xml:space="preserve">7.4 Files</w:t>
             </w:r>
@@ -562,7 +654,7 @@
             </w:r>
             <w:r>
               <w:fldChar w:fldCharType="begin" w:dirty="true"/>
-              <w:instrText xml:space="preserve">PAGEREF _Toc19 \h</w:instrText>
+              <w:instrText xml:space="preserve">PAGEREF _Toc23 \h</w:instrText>
               <w:fldChar w:fldCharType="separate"/>
               <w:fldChar w:fldCharType="end"/>
             </w:r>
@@ -9466,29 +9558,10 @@
     </w:p>
     <w:p>
       <w:pPr>
-        <w:pStyle w:val="Heading1"/>
-        <w:spacing w:after="160" w:before="360"/>
-      </w:pPr>
-      <w:bookmarkStart w:name="_Toc15" w:id="15"/>
-      <w:r>
-        <w:rPr>
-          <w:rFonts w:ascii="Calibri" w:cs="Calibri" w:eastAsia="Calibri" w:hAnsi="Calibri"/>
-          <w:b/>
-          <w:bCs/>
-          <w:color w:val="1F3A5F"/>
-          <w:sz w:val="32"/>
-          <w:szCs w:val="32"/>
-        </w:rPr>
-        <w:t xml:space="preserve">7. Evidence from the run</w:t>
-      </w:r>
-      <w:bookmarkEnd w:id="15"/>
-    </w:p>
-    <w:p>
-      <w:pPr>
         <w:pStyle w:val="Heading2"/>
         <w:spacing w:after="120" w:before="240"/>
       </w:pPr>
-      <w:bookmarkStart w:name="_Toc16" w:id="16"/>
+      <w:bookmarkStart w:name="_Toc15" w:id="15"/>
       <w:r>
         <w:rPr>
           <w:rFonts w:ascii="Calibri" w:cs="Calibri" w:eastAsia="Calibri" w:hAnsi="Calibri"/>
@@ -9498,118 +9571,13 @@
           <w:sz w:val="26"/>
           <w:szCs w:val="26"/>
         </w:rPr>
-        <w:t xml:space="preserve">7.1 Server log events</w:t>
-      </w:r>
-      <w:bookmarkEnd w:id="16"/>
-    </w:p>
-    <w:p>
-      <w:pPr>
-        <w:shd w:fill="F3F3F3" w:color="auto" w:val="clear"/>
-        <w:spacing w:after="40"/>
-        <w:ind w:left="200"/>
-      </w:pPr>
-      <w:r>
-        <w:rPr>
-          <w:rFonts w:ascii="Consolas" w:cs="Consolas" w:eastAsia="Consolas" w:hAnsi="Consolas"/>
-          <w:sz w:val="18"/>
-          <w:szCs w:val="18"/>
-        </w:rPr>
-        <w:t xml:space="preserve">{"event":"apollo_variant_attempt","level":0,"label":"exact AI filters","totalEntries":3895,"pagePeople":100,"params":{"tags":["fintech"],"q":null,"size":["11,50"],"titles":["Founde</w:t>
-      </w:r>
-    </w:p>
-    <w:p>
-      <w:pPr>
-        <w:shd w:fill="F3F3F3" w:color="auto" w:val="clear"/>
-        <w:spacing w:after="40"/>
-        <w:ind w:left="200"/>
-      </w:pPr>
-      <w:r>
-        <w:rPr>
-          <w:rFonts w:ascii="Consolas" w:cs="Consolas" w:eastAsia="Consolas" w:hAnsi="Consolas"/>
-          <w:sz w:val="18"/>
-          <w:szCs w:val="18"/>
-        </w:rPr>
-        <w:t xml:space="preserve">{"event":"apollo_variant_selected","level":0,"label":"exact AI filters","totalEntries":3895,"relaxed":false}</w:t>
-      </w:r>
-    </w:p>
-    <w:p>
-      <w:pPr>
-        <w:shd w:fill="F3F3F3" w:color="auto" w:val="clear"/>
-        <w:spacing w:after="40"/>
-        <w:ind w:left="200"/>
-      </w:pPr>
-      <w:r>
-        <w:rPr>
-          <w:rFonts w:ascii="Consolas" w:cs="Consolas" w:eastAsia="Consolas" w:hAnsi="Consolas"/>
-          <w:sz w:val="18"/>
-          <w:szCs w:val="18"/>
-        </w:rPr>
-        <w:t xml:space="preserve">{"event":"prescreen","candidates":100,"passed":94,"dropped":6,"minScore":60,"durationMs":31208}</w:t>
-      </w:r>
-    </w:p>
-    <w:p>
-      <w:pPr>
-        <w:shd w:fill="F3F3F3" w:color="auto" w:val="clear"/>
-        <w:spacing w:after="40"/>
-        <w:ind w:left="200"/>
-      </w:pPr>
-      <w:r>
-        <w:rPr>
-          <w:rFonts w:ascii="Consolas" w:cs="Consolas" w:eastAsia="Consolas" w:hAnsi="Consolas"/>
-          <w:sz w:val="18"/>
-          <w:szCs w:val="18"/>
-        </w:rPr>
-        <w:t xml:space="preserve">{"event":"stage_chunk_summary","stage":"unlock","people":30,"unlockedEmail":10,"chunkFailures":0,"chunkCount":1,"medianMs":1777,"p95Ms":1777,"maxMs":1777,"revealPersonal":false,"st</w:t>
-      </w:r>
-    </w:p>
-    <w:p>
-      <w:pPr>
-        <w:shd w:fill="F3F3F3" w:color="auto" w:val="clear"/>
-        <w:spacing w:after="40"/>
-        <w:ind w:left="200"/>
-      </w:pPr>
-      <w:r>
-        <w:rPr>
-          <w:rFonts w:ascii="Consolas" w:cs="Consolas" w:eastAsia="Consolas" w:hAnsi="Consolas"/>
-          <w:sz w:val="18"/>
-          <w:szCs w:val="18"/>
-        </w:rPr>
-        <w:t xml:space="preserve">{"event":"contact_pool_saved","saved":10}</w:t>
-      </w:r>
-    </w:p>
-    <w:p>
-      <w:pPr>
-        <w:shd w:fill="F3F3F3" w:color="auto" w:val="clear"/>
-        <w:spacing w:after="40"/>
-        <w:ind w:left="200"/>
-      </w:pPr>
-      <w:r>
-        <w:rPr>
-          <w:rFonts w:ascii="Consolas" w:cs="Consolas" w:eastAsia="Consolas" w:hAnsi="Consolas"/>
-          <w:sz w:val="18"/>
-          <w:szCs w:val="18"/>
-        </w:rPr>
-        <w:t xml:space="preserve">{"event":"postcheck","candidates":10,"passed":7,"dropped":3,"minScore":60,"durationMs":3841}</w:t>
-      </w:r>
-    </w:p>
-    <w:p>
-      <w:pPr>
-        <w:shd w:fill="F3F3F3" w:color="auto" w:val="clear"/>
-        <w:spacing w:after="40"/>
-        <w:ind w:left="200"/>
-      </w:pPr>
-      <w:r>
-        <w:rPr>
-          <w:rFonts w:ascii="Consolas" w:cs="Consolas" w:eastAsia="Consolas" w:hAnsi="Consolas"/>
-          <w:sz w:val="18"/>
-          <w:szCs w:val="18"/>
-        </w:rPr>
-        <w:t xml:space="preserve">{"event":"batch_complete","batchIndex":1,"fetched":100,"savedWithEmail":7,"skippedUnverified":0,"leadsFetched":100,"leadsWithEmail":7,"lastPage":1,"totalPages":10,"unlockAttempts":</w:t>
-      </w:r>
-    </w:p>
-    <w:p>
-      <w:pPr>
-        <w:spacing w:after="80" w:before="0"/>
+        <w:t xml:space="preserve">6.4 How all of this data was collected, and what it cost</w:t>
+      </w:r>
+      <w:bookmarkEnd w:id="15"/>
+    </w:p>
+    <w:p>
+      <w:pPr>
+        <w:spacing w:after="120" w:before="0"/>
       </w:pPr>
       <w:r>
         <w:rPr>
@@ -9617,221 +9585,7 @@
           <w:sz w:val="22"/>
           <w:szCs w:val="22"/>
         </w:rPr>
-        <w:t xml:space="preserve"/>
-      </w:r>
-    </w:p>
-    <w:p>
-      <w:pPr>
-        <w:pStyle w:val="Heading2"/>
-        <w:spacing w:after="120" w:before="240"/>
-      </w:pPr>
-      <w:bookmarkStart w:name="_Toc17" w:id="17"/>
-      <w:r>
-        <w:rPr>
-          <w:rFonts w:ascii="Calibri" w:cs="Calibri" w:eastAsia="Calibri" w:hAnsi="Calibri"/>
-          <w:b/>
-          <w:bCs/>
-          <w:color w:val="1F3A5F"/>
-          <w:sz w:val="26"/>
-          <w:szCs w:val="26"/>
-        </w:rPr>
-        <w:t xml:space="preserve">7.2 Credit measurement</w:t>
-      </w:r>
-      <w:bookmarkEnd w:id="17"/>
-    </w:p>
-    <w:p>
-      <w:pPr>
-        <w:shd w:fill="F3F3F3" w:color="auto" w:val="clear"/>
-        <w:spacing w:after="40"/>
-        <w:ind w:left="200"/>
-      </w:pPr>
-      <w:r>
-        <w:rPr>
-          <w:rFonts w:ascii="Consolas" w:cs="Consolas" w:eastAsia="Consolas" w:hAnsi="Consolas"/>
-          <w:sz w:val="18"/>
-          <w:szCs w:val="18"/>
-        </w:rPr>
-        <w:t xml:space="preserve">Apollo usage_stats/credit_usage_stats, lead_credit.consumed:</w:t>
-      </w:r>
-    </w:p>
-    <w:p>
-      <w:pPr>
-        <w:shd w:fill="F3F3F3" w:color="auto" w:val="clear"/>
-        <w:spacing w:after="40"/>
-        <w:ind w:left="200"/>
-      </w:pPr>
-      <w:r>
-        <w:rPr>
-          <w:rFonts w:ascii="Consolas" w:cs="Consolas" w:eastAsia="Consolas" w:hAnsi="Consolas"/>
-          <w:sz w:val="18"/>
-          <w:szCs w:val="18"/>
-        </w:rPr>
-        <w:t xml:space="preserve">  idle 40s before run:   +0   (45,373)</w:t>
-      </w:r>
-    </w:p>
-    <w:p>
-      <w:pPr>
-        <w:shd w:fill="F3F3F3" w:color="auto" w:val="clear"/>
-        <w:spacing w:after="40"/>
-        <w:ind w:left="200"/>
-      </w:pPr>
-      <w:r>
-        <w:rPr>
-          <w:rFonts w:ascii="Consolas" w:cs="Consolas" w:eastAsia="Consolas" w:hAnsi="Consolas"/>
-          <w:sz w:val="18"/>
-          <w:szCs w:val="18"/>
-        </w:rPr>
-        <w:t xml:space="preserve">  run:                   +10  (45,383)</w:t>
-      </w:r>
-    </w:p>
-    <w:p>
-      <w:pPr>
-        <w:shd w:fill="F3F3F3" w:color="auto" w:val="clear"/>
-        <w:spacing w:after="40"/>
-        <w:ind w:left="200"/>
-      </w:pPr>
-      <w:r>
-        <w:rPr>
-          <w:rFonts w:ascii="Consolas" w:cs="Consolas" w:eastAsia="Consolas" w:hAnsi="Consolas"/>
-          <w:sz w:val="18"/>
-          <w:szCs w:val="18"/>
-        </w:rPr>
-        <w:t xml:space="preserve">  idle 40s after run:    +0</w:t>
-      </w:r>
-    </w:p>
-    <w:p>
-      <w:pPr>
-        <w:shd w:fill="F3F3F3" w:color="auto" w:val="clear"/>
-        <w:spacing w:after="40"/>
-        <w:ind w:left="200"/>
-      </w:pPr>
-      <w:r>
-        <w:rPr>
-          <w:rFonts w:ascii="Consolas" w:cs="Consolas" w:eastAsia="Consolas" w:hAnsi="Consolas"/>
-          <w:sz w:val="18"/>
-          <w:szCs w:val="18"/>
-        </w:rPr>
-        <w:t xml:space="preserve">  app log unlockAttempts: 10, creditsPerSavedLead: 1.43</w:t>
-      </w:r>
-    </w:p>
-    <w:p>
-      <w:pPr>
-        <w:spacing w:after="80" w:before="0"/>
-      </w:pPr>
-      <w:r>
-        <w:rPr>
-          <w:rFonts w:ascii="Calibri" w:cs="Calibri" w:eastAsia="Calibri" w:hAnsi="Calibri"/>
-          <w:sz w:val="22"/>
-          <w:szCs w:val="22"/>
-        </w:rPr>
-        <w:t xml:space="preserve"/>
-      </w:r>
-    </w:p>
-    <w:p>
-      <w:pPr>
-        <w:pStyle w:val="Heading2"/>
-        <w:spacing w:after="120" w:before="240"/>
-      </w:pPr>
-      <w:bookmarkStart w:name="_Toc18" w:id="18"/>
-      <w:r>
-        <w:rPr>
-          <w:rFonts w:ascii="Calibri" w:cs="Calibri" w:eastAsia="Calibri" w:hAnsi="Calibri"/>
-          <w:b/>
-          <w:bCs/>
-          <w:color w:val="1F3A5F"/>
-          <w:sz w:val="26"/>
-          <w:szCs w:val="26"/>
-        </w:rPr>
-        <w:t xml:space="preserve">7.3 Independent audit call</w:t>
-      </w:r>
-      <w:bookmarkEnd w:id="18"/>
-    </w:p>
-    <w:p>
-      <w:pPr>
-        <w:shd w:fill="F3F3F3" w:color="auto" w:val="clear"/>
-        <w:spacing w:after="40"/>
-        <w:ind w:left="200"/>
-      </w:pPr>
-      <w:r>
-        <w:rPr>
-          <w:rFonts w:ascii="Consolas" w:cs="Consolas" w:eastAsia="Consolas" w:hAnsi="Consolas"/>
-          <w:sz w:val="18"/>
-          <w:szCs w:val="18"/>
-        </w:rPr>
-        <w:t xml:space="preserve">model: gpt-4o, temperature 0, JSON output</w:t>
-      </w:r>
-    </w:p>
-    <w:p>
-      <w:pPr>
-        <w:shd w:fill="F3F3F3" w:color="auto" w:val="clear"/>
-        <w:spacing w:after="40"/>
-        <w:ind w:left="200"/>
-      </w:pPr>
-      <w:r>
-        <w:rPr>
-          <w:rFonts w:ascii="Consolas" w:cs="Consolas" w:eastAsia="Consolas" w:hAnsi="Consolas"/>
-          <w:sz w:val="18"/>
-          <w:szCs w:val="18"/>
-        </w:rPr>
-        <w:t xml:space="preserve">system: "You are an independent auditor of B2B lead quality. You did not produce these leads..."</w:t>
-      </w:r>
-    </w:p>
-    <w:p>
-      <w:pPr>
-        <w:shd w:fill="F3F3F3" w:color="auto" w:val="clear"/>
-        <w:spacing w:after="40"/>
-        <w:ind w:left="200"/>
-      </w:pPr>
-      <w:r>
-        <w:rPr>
-          <w:rFonts w:ascii="Consolas" w:cs="Consolas" w:eastAsia="Consolas" w:hAnsi="Consolas"/>
-          <w:sz w:val="18"/>
-          <w:szCs w:val="18"/>
-        </w:rPr>
-        <w:t xml:space="preserve">input: the request + name, title, company, industry, employees, location for all 10 unlocked people</w:t>
-      </w:r>
-    </w:p>
-    <w:p>
-      <w:pPr>
-        <w:shd w:fill="F3F3F3" w:color="auto" w:val="clear"/>
-        <w:spacing w:after="40"/>
-        <w:ind w:left="200"/>
-      </w:pPr>
-      <w:r>
-        <w:rPr>
-          <w:rFonts w:ascii="Consolas" w:cs="Consolas" w:eastAsia="Consolas" w:hAnsi="Consolas"/>
-          <w:sz w:val="18"/>
-          <w:szCs w:val="18"/>
-        </w:rPr>
-        <w:t xml:space="preserve">output: role_fit, industry_fit, size_fit, location_fit, overall (good/borderline/bad), why</w:t>
-      </w:r>
-    </w:p>
-    <w:p>
-      <w:pPr>
-        <w:shd w:fill="F3F3F3" w:color="auto" w:val="clear"/>
-        <w:spacing w:after="40"/>
-        <w:ind w:left="200"/>
-      </w:pPr>
-      <w:r>
-        <w:rPr>
-          <w:rFonts w:ascii="Consolas" w:cs="Consolas" w:eastAsia="Consolas" w:hAnsi="Consolas"/>
-          <w:sz w:val="18"/>
-          <w:szCs w:val="18"/>
-        </w:rPr>
-        <w:t xml:space="preserve">tokens: 1,402 (about a tenth of a cent)</w:t>
-      </w:r>
-    </w:p>
-    <w:p>
-      <w:pPr>
-        <w:spacing w:after="80" w:before="0"/>
-      </w:pPr>
-      <w:r>
-        <w:rPr>
-          <w:rFonts w:ascii="Calibri" w:cs="Calibri" w:eastAsia="Calibri" w:hAnsi="Calibri"/>
-          <w:sz w:val="22"/>
-          <w:szCs w:val="22"/>
-        </w:rPr>
-        <w:t xml:space="preserve"/>
+        <w:t xml:space="preserve">Apollo has two kinds of calls. Search calls answer “how many people match these filters, and who are the first few”; they return a first name, a masked last name, a job title and a company name, and nothing you could contact. Unlock calls reveal one person's email and full record and cost one lead credit each. Every number in sections 5 and 6 came from search calls only. Nobody was unlocked to produce them.</w:t>
       </w:r>
     </w:p>
     <w:p>
@@ -9842,7 +9596,7 @@
       <w:r>
         <w:drawing>
           <wp:inline distT="0" distB="0" distL="0" distR="0">
-            <wp:extent cx="5524500" cy="5753100"/>
+            <wp:extent cx="5524500" cy="2000250"/>
             <wp:effectExtent t="0" r="0" b="0" l="0"/>
             <wp:docPr id="2" name=""/>
             <wp:cNvGraphicFramePr>
@@ -9867,6 +9621,1992 @@
                   <pic:spPr bwMode="auto">
                     <a:xfrm>
                       <a:off x="0" y="0"/>
+                      <a:ext cx="5524500" cy="2000250"/>
+                    </a:xfrm>
+                    <a:prstGeom prst="rect">
+                      <a:avLst/>
+                    </a:prstGeom>
+                  </pic:spPr>
+                </pic:pic>
+              </a:graphicData>
+            </a:graphic>
+          </wp:inline>
+        </w:drawing>
+      </w:r>
+    </w:p>
+    <w:p>
+      <w:pPr>
+        <w:spacing w:after="240" w:before="0"/>
+        <w:jc w:val="center"/>
+      </w:pPr>
+      <w:r>
+        <w:rPr>
+          <w:rFonts w:ascii="Calibri" w:cs="Calibri" w:eastAsia="Calibri" w:hAnsi="Calibri"/>
+          <w:i/>
+          <w:iCs/>
+          <w:color w:val="595959"/>
+          <w:sz w:val="19"/>
+          <w:szCs w:val="19"/>
+        </w:rPr>
+        <w:t xml:space="preserve">Figure 3. The whole pipeline with each stage marked free or paid. Only the unlock stage spends Apollo credits.</w:t>
+      </w:r>
+    </w:p>
+    <w:p>
+      <w:pPr>
+        <w:pStyle w:val="Heading2"/>
+        <w:spacing w:after="120" w:before="240"/>
+      </w:pPr>
+      <w:bookmarkStart w:name="_Toc16" w:id="16"/>
+      <w:r>
+        <w:rPr>
+          <w:rFonts w:ascii="Calibri" w:cs="Calibri" w:eastAsia="Calibri" w:hAnsi="Calibri"/>
+          <w:b/>
+          <w:bCs/>
+          <w:color w:val="1F3A5F"/>
+          <w:sz w:val="26"/>
+          <w:szCs w:val="26"/>
+        </w:rPr>
+        <w:t xml:space="preserve">6.5 The exact method</w:t>
+      </w:r>
+      <w:bookmarkEnd w:id="16"/>
+    </w:p>
+    <w:p>
+      <w:pPr>
+        <w:pStyle w:val="ListParagraph"/>
+        <w:numPr>
+          <w:ilvl w:val="0"/>
+          <w:numId w:val="2"/>
+        </w:numPr>
+        <w:spacing w:after="60"/>
+      </w:pPr>
+      <w:r>
+        <w:rPr>
+          <w:rFonts w:ascii="Calibri" w:cs="Calibri" w:eastAsia="Calibri" w:hAnsi="Calibri"/>
+          <w:sz w:val="22"/>
+          <w:szCs w:val="22"/>
+        </w:rPr>
+        <w:t xml:space="preserve">For each target market, one search request was sent with the role titles, the location, the company-size band and the industry keyword tags, asking for 25 results per page.</w:t>
+      </w:r>
+    </w:p>
+    <w:p>
+      <w:pPr>
+        <w:pStyle w:val="ListParagraph"/>
+        <w:numPr>
+          <w:ilvl w:val="0"/>
+          <w:numId w:val="2"/>
+        </w:numPr>
+        <w:spacing w:after="60"/>
+      </w:pPr>
+      <w:r>
+        <w:rPr>
+          <w:rFonts w:ascii="Calibri" w:cs="Calibri" w:eastAsia="Calibri" w:hAnsi="Calibri"/>
+          <w:sz w:val="22"/>
+          <w:szCs w:val="22"/>
+        </w:rPr>
+        <w:t xml:space="preserve">Apollo's reply includes a total_entries number: how many people match in its whole database. That number is the “People in Apollo” column.</w:t>
+      </w:r>
+    </w:p>
+    <w:p>
+      <w:pPr>
+        <w:pStyle w:val="ListParagraph"/>
+        <w:numPr>
+          <w:ilvl w:val="0"/>
+          <w:numId w:val="2"/>
+        </w:numPr>
+        <w:spacing w:after="60"/>
+      </w:pPr>
+      <w:r>
+        <w:rPr>
+          <w:rFonts w:ascii="Calibri" w:cs="Calibri" w:eastAsia="Calibri" w:hAnsi="Calibri"/>
+          <w:sz w:val="22"/>
+          <w:szCs w:val="22"/>
+        </w:rPr>
+        <w:t xml:space="preserve">The same request was sent again with one extra filter, contact_email_status = verified. Its total_entries is the “With verified email” column, the pool we can actually draw leads from.</w:t>
+      </w:r>
+    </w:p>
+    <w:p>
+      <w:pPr>
+        <w:pStyle w:val="ListParagraph"/>
+        <w:numPr>
+          <w:ilvl w:val="0"/>
+          <w:numId w:val="2"/>
+        </w:numPr>
+        <w:spacing w:after="60"/>
+      </w:pPr>
+      <w:r>
+        <w:rPr>
+          <w:rFonts w:ascii="Calibri" w:cs="Calibri" w:eastAsia="Calibri" w:hAnsi="Calibri"/>
+          <w:sz w:val="22"/>
+          <w:szCs w:val="22"/>
+        </w:rPr>
+        <w:t xml:space="preserve">The first three names in each reply were kept as a sanity check that the filter was matching the right kind of company (that is how we saw that “restaurant” matches restaurant equipment suppliers).</w:t>
+      </w:r>
+    </w:p>
+    <w:p>
+      <w:pPr>
+        <w:pStyle w:val="ListParagraph"/>
+        <w:numPr>
+          <w:ilvl w:val="0"/>
+          <w:numId w:val="2"/>
+        </w:numPr>
+        <w:spacing w:after="60"/>
+      </w:pPr>
+      <w:r>
+        <w:rPr>
+          <w:rFonts w:ascii="Calibri" w:cs="Calibri" w:eastAsia="Calibri" w:hAnsi="Calibri"/>
+          <w:sz w:val="22"/>
+          <w:szCs w:val="22"/>
+        </w:rPr>
+        <w:t xml:space="preserve">The credit balance was read from Apollo's usage endpoint before and after, with idle waits on both sides to separate our calls from anyone else using the same account.</w:t>
+      </w:r>
+    </w:p>
+    <w:p>
+      <w:pPr>
+        <w:spacing w:after="120" w:before="0"/>
+      </w:pPr>
+      <w:r>
+        <w:rPr>
+          <w:rFonts w:ascii="Calibri" w:cs="Calibri" w:eastAsia="Calibri" w:hAnsi="Calibri"/>
+          <w:sz w:val="22"/>
+          <w:szCs w:val="22"/>
+        </w:rPr>
+        <w:t xml:space="preserve">This is the request that produced the fintech CTO row, with the key removed:</w:t>
+      </w:r>
+    </w:p>
+    <w:p>
+      <w:pPr>
+        <w:shd w:fill="F3F3F3" w:color="auto" w:val="clear"/>
+        <w:spacing w:after="40"/>
+        <w:ind w:left="200"/>
+      </w:pPr>
+      <w:r>
+        <w:rPr>
+          <w:rFonts w:ascii="Consolas" w:cs="Consolas" w:eastAsia="Consolas" w:hAnsi="Consolas"/>
+          <w:sz w:val="18"/>
+          <w:szCs w:val="18"/>
+        </w:rPr>
+        <w:t xml:space="preserve">POST https://api.apollo.io/api/v1/mixed_people/api_search</w:t>
+      </w:r>
+    </w:p>
+    <w:p>
+      <w:pPr>
+        <w:shd w:fill="F3F3F3" w:color="auto" w:val="clear"/>
+        <w:spacing w:after="40"/>
+        <w:ind w:left="200"/>
+      </w:pPr>
+      <w:r>
+        <w:rPr>
+          <w:rFonts w:ascii="Consolas" w:cs="Consolas" w:eastAsia="Consolas" w:hAnsi="Consolas"/>
+          <w:sz w:val="18"/>
+          <w:szCs w:val="18"/>
+        </w:rPr>
+        <w:t xml:space="preserve">headers: x-api-key: &lt;key&gt;, content-type: application/json</w:t>
+      </w:r>
+    </w:p>
+    <w:p>
+      <w:pPr>
+        <w:shd w:fill="F3F3F3" w:color="auto" w:val="clear"/>
+        <w:spacing w:after="40"/>
+        <w:ind w:left="200"/>
+      </w:pPr>
+      <w:r>
+        <w:rPr>
+          <w:rFonts w:ascii="Consolas" w:cs="Consolas" w:eastAsia="Consolas" w:hAnsi="Consolas"/>
+          <w:sz w:val="18"/>
+          <w:szCs w:val="18"/>
+        </w:rPr>
+        <w:t xml:space="preserve">{</w:t>
+      </w:r>
+    </w:p>
+    <w:p>
+      <w:pPr>
+        <w:shd w:fill="F3F3F3" w:color="auto" w:val="clear"/>
+        <w:spacing w:after="40"/>
+        <w:ind w:left="200"/>
+      </w:pPr>
+      <w:r>
+        <w:rPr>
+          <w:rFonts w:ascii="Consolas" w:cs="Consolas" w:eastAsia="Consolas" w:hAnsi="Consolas"/>
+          <w:sz w:val="18"/>
+          <w:szCs w:val="18"/>
+        </w:rPr>
+        <w:t xml:space="preserve">  "person_titles": ["CTO", "Chief Technology Officer", "VP Engineering"],</w:t>
+      </w:r>
+    </w:p>
+    <w:p>
+      <w:pPr>
+        <w:shd w:fill="F3F3F3" w:color="auto" w:val="clear"/>
+        <w:spacing w:after="40"/>
+        <w:ind w:left="200"/>
+      </w:pPr>
+      <w:r>
+        <w:rPr>
+          <w:rFonts w:ascii="Consolas" w:cs="Consolas" w:eastAsia="Consolas" w:hAnsi="Consolas"/>
+          <w:sz w:val="18"/>
+          <w:szCs w:val="18"/>
+        </w:rPr>
+        <w:t xml:space="preserve">  "person_locations": ["United States"],</w:t>
+      </w:r>
+    </w:p>
+    <w:p>
+      <w:pPr>
+        <w:shd w:fill="F3F3F3" w:color="auto" w:val="clear"/>
+        <w:spacing w:after="40"/>
+        <w:ind w:left="200"/>
+      </w:pPr>
+      <w:r>
+        <w:rPr>
+          <w:rFonts w:ascii="Consolas" w:cs="Consolas" w:eastAsia="Consolas" w:hAnsi="Consolas"/>
+          <w:sz w:val="18"/>
+          <w:szCs w:val="18"/>
+        </w:rPr>
+        <w:t xml:space="preserve">  "organization_num_employees_ranges": ["11,50"],</w:t>
+      </w:r>
+    </w:p>
+    <w:p>
+      <w:pPr>
+        <w:shd w:fill="F3F3F3" w:color="auto" w:val="clear"/>
+        <w:spacing w:after="40"/>
+        <w:ind w:left="200"/>
+      </w:pPr>
+      <w:r>
+        <w:rPr>
+          <w:rFonts w:ascii="Consolas" w:cs="Consolas" w:eastAsia="Consolas" w:hAnsi="Consolas"/>
+          <w:sz w:val="18"/>
+          <w:szCs w:val="18"/>
+        </w:rPr>
+        <w:t xml:space="preserve">  "q_organization_keyword_tags": ["fintech", "financial technology", "payments"],</w:t>
+      </w:r>
+    </w:p>
+    <w:p>
+      <w:pPr>
+        <w:shd w:fill="F3F3F3" w:color="auto" w:val="clear"/>
+        <w:spacing w:after="40"/>
+        <w:ind w:left="200"/>
+      </w:pPr>
+      <w:r>
+        <w:rPr>
+          <w:rFonts w:ascii="Consolas" w:cs="Consolas" w:eastAsia="Consolas" w:hAnsi="Consolas"/>
+          <w:sz w:val="18"/>
+          <w:szCs w:val="18"/>
+        </w:rPr>
+        <w:t xml:space="preserve">  "contact_email_status": ["verified"],</w:t>
+      </w:r>
+    </w:p>
+    <w:p>
+      <w:pPr>
+        <w:shd w:fill="F3F3F3" w:color="auto" w:val="clear"/>
+        <w:spacing w:after="40"/>
+        <w:ind w:left="200"/>
+      </w:pPr>
+      <w:r>
+        <w:rPr>
+          <w:rFonts w:ascii="Consolas" w:cs="Consolas" w:eastAsia="Consolas" w:hAnsi="Consolas"/>
+          <w:sz w:val="18"/>
+          <w:szCs w:val="18"/>
+        </w:rPr>
+        <w:t xml:space="preserve">  "include_similar_titles": false, "page": 1, "per_page": 25</w:t>
+      </w:r>
+    </w:p>
+    <w:p>
+      <w:pPr>
+        <w:shd w:fill="F3F3F3" w:color="auto" w:val="clear"/>
+        <w:spacing w:after="40"/>
+        <w:ind w:left="200"/>
+      </w:pPr>
+      <w:r>
+        <w:rPr>
+          <w:rFonts w:ascii="Consolas" w:cs="Consolas" w:eastAsia="Consolas" w:hAnsi="Consolas"/>
+          <w:sz w:val="18"/>
+          <w:szCs w:val="18"/>
+        </w:rPr>
+        <w:t xml:space="preserve">}</w:t>
+      </w:r>
+    </w:p>
+    <w:p>
+      <w:pPr>
+        <w:shd w:fill="F3F3F3" w:color="auto" w:val="clear"/>
+        <w:spacing w:after="40"/>
+        <w:ind w:left="200"/>
+      </w:pPr>
+      <w:r>
+        <w:rPr>
+          <w:rFonts w:ascii="Consolas" w:cs="Consolas" w:eastAsia="Consolas" w:hAnsi="Consolas"/>
+          <w:sz w:val="18"/>
+          <w:szCs w:val="18"/>
+        </w:rPr>
+        <w:t xml:space="preserve">-&gt; { "total_entries": 1182, "people": [ { "first_name": "...", "last_name_obfuscated": "Pe***n",</w:t>
+      </w:r>
+    </w:p>
+    <w:p>
+      <w:pPr>
+        <w:shd w:fill="F3F3F3" w:color="auto" w:val="clear"/>
+        <w:spacing w:after="40"/>
+        <w:ind w:left="200"/>
+      </w:pPr>
+      <w:r>
+        <w:rPr>
+          <w:rFonts w:ascii="Consolas" w:cs="Consolas" w:eastAsia="Consolas" w:hAnsi="Consolas"/>
+          <w:sz w:val="18"/>
+          <w:szCs w:val="18"/>
+        </w:rPr>
+        <w:t xml:space="preserve">     "title": "Chief Technology Officer", "organization": { "name": "Neural Payments" }, "has_email": true, ... } ] }</w:t>
+      </w:r>
+    </w:p>
+    <w:p>
+      <w:pPr>
+        <w:spacing w:after="80" w:before="0"/>
+      </w:pPr>
+      <w:r>
+        <w:rPr>
+          <w:rFonts w:ascii="Calibri" w:cs="Calibri" w:eastAsia="Calibri" w:hAnsi="Calibri"/>
+          <w:sz w:val="22"/>
+          <w:szCs w:val="22"/>
+        </w:rPr>
+        <w:t xml:space="preserve"/>
+      </w:r>
+    </w:p>
+    <w:p>
+      <w:pPr>
+        <w:spacing w:after="60" w:before="120"/>
+        <w:jc w:val="center"/>
+      </w:pPr>
+      <w:r>
+        <w:drawing>
+          <wp:inline distT="0" distB="0" distL="0" distR="0">
+            <wp:extent cx="5524500" cy="3533775"/>
+            <wp:effectExtent t="0" r="0" b="0" l="0"/>
+            <wp:docPr id="3" name=""/>
+            <wp:cNvGraphicFramePr>
+              <a:graphicFrameLocks xmlns:a="http://schemas.openxmlformats.org/drawingml/2006/main" noChangeAspect="1"/>
+            </wp:cNvGraphicFramePr>
+            <a:graphic xmlns:a="http://schemas.openxmlformats.org/drawingml/2006/main">
+              <a:graphicData uri="http://schemas.openxmlformats.org/drawingml/2006/picture">
+                <pic:pic xmlns:pic="http://schemas.openxmlformats.org/drawingml/2006/picture">
+                  <pic:nvPicPr>
+                    <pic:cNvPr id="0" name="" descr=""/>
+                    <pic:cNvPicPr>
+                      <a:picLocks noChangeAspect="1" noChangeArrowheads="1"/>
+                    </pic:cNvPicPr>
+                  </pic:nvPicPr>
+                  <pic:blipFill>
+                    <a:blip r:embed="rId11" cstate="none"/>
+                    <a:srcRect/>
+                    <a:stretch>
+                      <a:fillRect/>
+                    </a:stretch>
+                  </pic:blipFill>
+                  <pic:spPr bwMode="auto">
+                    <a:xfrm>
+                      <a:off x="0" y="0"/>
+                      <a:ext cx="5524500" cy="3533775"/>
+                    </a:xfrm>
+                    <a:prstGeom prst="rect">
+                      <a:avLst/>
+                    </a:prstGeom>
+                  </pic:spPr>
+                </pic:pic>
+              </a:graphicData>
+            </a:graphic>
+          </wp:inline>
+        </w:drawing>
+      </w:r>
+    </w:p>
+    <w:p>
+      <w:pPr>
+        <w:spacing w:after="240" w:before="0"/>
+        <w:jc w:val="center"/>
+      </w:pPr>
+      <w:r>
+        <w:rPr>
+          <w:rFonts w:ascii="Calibri" w:cs="Calibri" w:eastAsia="Calibri" w:hAnsi="Calibri"/>
+          <w:i/>
+          <w:iCs/>
+          <w:color w:val="595959"/>
+          <w:sz w:val="19"/>
+          <w:szCs w:val="19"/>
+        </w:rPr>
+        <w:t xml:space="preserve">Figure 4. The measured pools on a log scale. Green is a usable target market, amber is weak, red is unusable as written. The shaded band is the sweet spot.</w:t>
+      </w:r>
+    </w:p>
+    <w:p>
+      <w:pPr>
+        <w:pStyle w:val="Heading2"/>
+        <w:spacing w:after="120" w:before="240"/>
+      </w:pPr>
+      <w:bookmarkStart w:name="_Toc17" w:id="17"/>
+      <w:r>
+        <w:rPr>
+          <w:rFonts w:ascii="Calibri" w:cs="Calibri" w:eastAsia="Calibri" w:hAnsi="Calibri"/>
+          <w:b/>
+          <w:bCs/>
+          <w:color w:val="1F3A5F"/>
+          <w:sz w:val="26"/>
+          <w:szCs w:val="26"/>
+        </w:rPr>
+        <w:t xml:space="preserve">6.6 Proof that search calls do not spend credits</w:t>
+      </w:r>
+      <w:bookmarkEnd w:id="17"/>
+    </w:p>
+    <w:p>
+      <w:pPr>
+        <w:spacing w:after="120" w:before="0"/>
+      </w:pPr>
+      <w:r>
+        <w:rPr>
+          <w:rFonts w:ascii="Calibri" w:cs="Calibri" w:eastAsia="Calibri" w:hAnsi="Calibri"/>
+          <w:sz w:val="22"/>
+          <w:szCs w:val="22"/>
+        </w:rPr>
+        <w:t xml:space="preserve">To be sure the numbers above were really free, ten search calls of 100 people each (1,000 people viewed) were made in a row, with the credit balance read before and after and two-minute idle periods on both sides to catch delayed charges and anyone else's activity on the shared account.</w:t>
+      </w:r>
+    </w:p>
+    <w:tbl>
+      <w:tblPr>
+        <w:tblW w:type="dxa" w:w="10080"/>
+        <w:tblBorders>
+          <w:top w:val="single" w:color="auto" w:sz="4"/>
+          <w:left w:val="single" w:color="auto" w:sz="4"/>
+          <w:bottom w:val="single" w:color="auto" w:sz="4"/>
+          <w:right w:val="single" w:color="auto" w:sz="4"/>
+          <w:insideH w:val="single" w:color="auto" w:sz="4"/>
+          <w:insideV w:val="single" w:color="auto" w:sz="4"/>
+        </w:tblBorders>
+        <w:tblLayout w:type="fixed"/>
+      </w:tblPr>
+      <w:tblGrid>
+        <w:gridCol w:w="4200"/>
+        <w:gridCol w:w="3600"/>
+        <w:gridCol w:w="2280"/>
+      </w:tblGrid>
+      <w:tr>
+        <w:trPr>
+          <w:tblHeader/>
+        </w:trPr>
+        <w:tc>
+          <w:tcPr>
+            <w:tcW w:type="dxa" w:w="4200"/>
+            <w:shd w:fill="1F3A5F" w:color="auto" w:val="clear"/>
+            <w:tcMar>
+              <w:top w:type="dxa" w:w="60"/>
+              <w:left w:type="dxa" w:w="100"/>
+              <w:bottom w:type="dxa" w:w="60"/>
+              <w:right w:type="dxa" w:w="100"/>
+            </w:tcMar>
+          </w:tcPr>
+          <w:p>
+            <w:pPr>
+              <w:spacing w:after="0"/>
+            </w:pPr>
+            <w:r>
+              <w:rPr>
+                <w:rFonts w:ascii="Calibri" w:cs="Calibri" w:eastAsia="Calibri" w:hAnsi="Calibri"/>
+                <w:b/>
+                <w:bCs/>
+                <w:color w:val="FFFFFF"/>
+                <w:sz w:val="19"/>
+                <w:szCs w:val="19"/>
+              </w:rPr>
+              <w:t xml:space="preserve">Step</w:t>
+            </w:r>
+          </w:p>
+        </w:tc>
+        <w:tc>
+          <w:tcPr>
+            <w:tcW w:type="dxa" w:w="3600"/>
+            <w:shd w:fill="1F3A5F" w:color="auto" w:val="clear"/>
+            <w:tcMar>
+              <w:top w:type="dxa" w:w="60"/>
+              <w:left w:type="dxa" w:w="100"/>
+              <w:bottom w:type="dxa" w:w="60"/>
+              <w:right w:type="dxa" w:w="100"/>
+            </w:tcMar>
+          </w:tcPr>
+          <w:p>
+            <w:pPr>
+              <w:spacing w:after="0"/>
+            </w:pPr>
+            <w:r>
+              <w:rPr>
+                <w:rFonts w:ascii="Calibri" w:cs="Calibri" w:eastAsia="Calibri" w:hAnsi="Calibri"/>
+                <w:b/>
+                <w:bCs/>
+                <w:color w:val="FFFFFF"/>
+                <w:sz w:val="19"/>
+                <w:szCs w:val="19"/>
+              </w:rPr>
+              <w:t xml:space="preserve">Lead credits consumed (Apollo counter)</w:t>
+            </w:r>
+          </w:p>
+        </w:tc>
+        <w:tc>
+          <w:tcPr>
+            <w:tcW w:type="dxa" w:w="2280"/>
+            <w:shd w:fill="1F3A5F" w:color="auto" w:val="clear"/>
+            <w:tcMar>
+              <w:top w:type="dxa" w:w="60"/>
+              <w:left w:type="dxa" w:w="100"/>
+              <w:bottom w:type="dxa" w:w="60"/>
+              <w:right w:type="dxa" w:w="100"/>
+            </w:tcMar>
+          </w:tcPr>
+          <w:p>
+            <w:pPr>
+              <w:spacing w:after="0"/>
+            </w:pPr>
+            <w:r>
+              <w:rPr>
+                <w:rFonts w:ascii="Calibri" w:cs="Calibri" w:eastAsia="Calibri" w:hAnsi="Calibri"/>
+                <w:b/>
+                <w:bCs/>
+                <w:color w:val="FFFFFF"/>
+                <w:sz w:val="19"/>
+                <w:szCs w:val="19"/>
+              </w:rPr>
+              <w:t xml:space="preserve">Change</w:t>
+            </w:r>
+          </w:p>
+        </w:tc>
+      </w:tr>
+      <w:tr>
+        <w:tc>
+          <w:tcPr>
+            <w:tcW w:type="dxa" w:w="4200"/>
+            <w:tcMar>
+              <w:top w:type="dxa" w:w="60"/>
+              <w:left w:type="dxa" w:w="100"/>
+              <w:bottom w:type="dxa" w:w="60"/>
+              <w:right w:type="dxa" w:w="100"/>
+            </w:tcMar>
+          </w:tcPr>
+          <w:p>
+            <w:pPr>
+              <w:spacing w:after="0"/>
+            </w:pPr>
+            <w:r>
+              <w:rPr>
+                <w:rFonts w:ascii="Calibri" w:cs="Calibri" w:eastAsia="Calibri" w:hAnsi="Calibri"/>
+                <w:sz w:val="19"/>
+                <w:szCs w:val="19"/>
+              </w:rPr>
+              <w:t xml:space="preserve">Balance read</w:t>
+            </w:r>
+          </w:p>
+        </w:tc>
+        <w:tc>
+          <w:tcPr>
+            <w:tcW w:type="dxa" w:w="3600"/>
+            <w:tcMar>
+              <w:top w:type="dxa" w:w="60"/>
+              <w:left w:type="dxa" w:w="100"/>
+              <w:bottom w:type="dxa" w:w="60"/>
+              <w:right w:type="dxa" w:w="100"/>
+            </w:tcMar>
+          </w:tcPr>
+          <w:p>
+            <w:pPr>
+              <w:spacing w:after="0"/>
+            </w:pPr>
+            <w:r>
+              <w:rPr>
+                <w:rFonts w:ascii="Calibri" w:cs="Calibri" w:eastAsia="Calibri" w:hAnsi="Calibri"/>
+                <w:sz w:val="19"/>
+                <w:szCs w:val="19"/>
+              </w:rPr>
+              <w:t xml:space="preserve">45,476</w:t>
+            </w:r>
+          </w:p>
+        </w:tc>
+        <w:tc>
+          <w:tcPr>
+            <w:tcW w:type="dxa" w:w="2280"/>
+            <w:tcMar>
+              <w:top w:type="dxa" w:w="60"/>
+              <w:left w:type="dxa" w:w="100"/>
+              <w:bottom w:type="dxa" w:w="60"/>
+              <w:right w:type="dxa" w:w="100"/>
+            </w:tcMar>
+          </w:tcPr>
+          <w:p>
+            <w:pPr>
+              <w:spacing w:after="0"/>
+            </w:pPr>
+            <w:r>
+              <w:rPr>
+                <w:rFonts w:ascii="Calibri" w:cs="Calibri" w:eastAsia="Calibri" w:hAnsi="Calibri"/>
+                <w:sz w:val="19"/>
+                <w:szCs w:val="19"/>
+              </w:rPr>
+              <w:t xml:space="preserve"/>
+            </w:r>
+          </w:p>
+        </w:tc>
+      </w:tr>
+      <w:tr>
+        <w:tc>
+          <w:tcPr>
+            <w:tcW w:type="dxa" w:w="4200"/>
+            <w:shd w:fill="F2F5F9" w:color="auto" w:val="clear"/>
+            <w:tcMar>
+              <w:top w:type="dxa" w:w="60"/>
+              <w:left w:type="dxa" w:w="100"/>
+              <w:bottom w:type="dxa" w:w="60"/>
+              <w:right w:type="dxa" w:w="100"/>
+            </w:tcMar>
+          </w:tcPr>
+          <w:p>
+            <w:pPr>
+              <w:spacing w:after="0"/>
+            </w:pPr>
+            <w:r>
+              <w:rPr>
+                <w:rFonts w:ascii="Calibri" w:cs="Calibri" w:eastAsia="Calibri" w:hAnsi="Calibri"/>
+                <w:sz w:val="19"/>
+                <w:szCs w:val="19"/>
+              </w:rPr>
+              <w:t xml:space="preserve">Idle 120 s</w:t>
+            </w:r>
+          </w:p>
+        </w:tc>
+        <w:tc>
+          <w:tcPr>
+            <w:tcW w:type="dxa" w:w="3600"/>
+            <w:shd w:fill="F2F5F9" w:color="auto" w:val="clear"/>
+            <w:tcMar>
+              <w:top w:type="dxa" w:w="60"/>
+              <w:left w:type="dxa" w:w="100"/>
+              <w:bottom w:type="dxa" w:w="60"/>
+              <w:right w:type="dxa" w:w="100"/>
+            </w:tcMar>
+          </w:tcPr>
+          <w:p>
+            <w:pPr>
+              <w:spacing w:after="0"/>
+            </w:pPr>
+            <w:r>
+              <w:rPr>
+                <w:rFonts w:ascii="Calibri" w:cs="Calibri" w:eastAsia="Calibri" w:hAnsi="Calibri"/>
+                <w:sz w:val="19"/>
+                <w:szCs w:val="19"/>
+              </w:rPr>
+              <w:t xml:space="preserve">45,476</w:t>
+            </w:r>
+          </w:p>
+        </w:tc>
+        <w:tc>
+          <w:tcPr>
+            <w:tcW w:type="dxa" w:w="2280"/>
+            <w:shd w:fill="F2F5F9" w:color="auto" w:val="clear"/>
+            <w:tcMar>
+              <w:top w:type="dxa" w:w="60"/>
+              <w:left w:type="dxa" w:w="100"/>
+              <w:bottom w:type="dxa" w:w="60"/>
+              <w:right w:type="dxa" w:w="100"/>
+            </w:tcMar>
+          </w:tcPr>
+          <w:p>
+            <w:pPr>
+              <w:spacing w:after="0"/>
+            </w:pPr>
+            <w:r>
+              <w:rPr>
+                <w:rFonts w:ascii="Calibri" w:cs="Calibri" w:eastAsia="Calibri" w:hAnsi="Calibri"/>
+                <w:sz w:val="19"/>
+                <w:szCs w:val="19"/>
+              </w:rPr>
+              <w:t xml:space="preserve">+0</w:t>
+            </w:r>
+          </w:p>
+        </w:tc>
+      </w:tr>
+      <w:tr>
+        <w:tc>
+          <w:tcPr>
+            <w:tcW w:type="dxa" w:w="4200"/>
+            <w:tcMar>
+              <w:top w:type="dxa" w:w="60"/>
+              <w:left w:type="dxa" w:w="100"/>
+              <w:bottom w:type="dxa" w:w="60"/>
+              <w:right w:type="dxa" w:w="100"/>
+            </w:tcMar>
+          </w:tcPr>
+          <w:p>
+            <w:pPr>
+              <w:spacing w:after="0"/>
+            </w:pPr>
+            <w:r>
+              <w:rPr>
+                <w:rFonts w:ascii="Calibri" w:cs="Calibri" w:eastAsia="Calibri" w:hAnsi="Calibri"/>
+                <w:sz w:val="19"/>
+                <w:szCs w:val="19"/>
+              </w:rPr>
+              <w:t xml:space="preserve">10 search calls, 1,000 people viewed, then wait 150 s</w:t>
+            </w:r>
+          </w:p>
+        </w:tc>
+        <w:tc>
+          <w:tcPr>
+            <w:tcW w:type="dxa" w:w="3600"/>
+            <w:tcMar>
+              <w:top w:type="dxa" w:w="60"/>
+              <w:left w:type="dxa" w:w="100"/>
+              <w:bottom w:type="dxa" w:w="60"/>
+              <w:right w:type="dxa" w:w="100"/>
+            </w:tcMar>
+          </w:tcPr>
+          <w:p>
+            <w:pPr>
+              <w:spacing w:after="0"/>
+            </w:pPr>
+            <w:r>
+              <w:rPr>
+                <w:rFonts w:ascii="Calibri" w:cs="Calibri" w:eastAsia="Calibri" w:hAnsi="Calibri"/>
+                <w:sz w:val="19"/>
+                <w:szCs w:val="19"/>
+              </w:rPr>
+              <w:t xml:space="preserve">45,476</w:t>
+            </w:r>
+          </w:p>
+        </w:tc>
+        <w:tc>
+          <w:tcPr>
+            <w:tcW w:type="dxa" w:w="2280"/>
+            <w:tcMar>
+              <w:top w:type="dxa" w:w="60"/>
+              <w:left w:type="dxa" w:w="100"/>
+              <w:bottom w:type="dxa" w:w="60"/>
+              <w:right w:type="dxa" w:w="100"/>
+            </w:tcMar>
+          </w:tcPr>
+          <w:p>
+            <w:pPr>
+              <w:spacing w:after="0"/>
+            </w:pPr>
+            <w:r>
+              <w:rPr>
+                <w:rFonts w:ascii="Calibri" w:cs="Calibri" w:eastAsia="Calibri" w:hAnsi="Calibri"/>
+                <w:sz w:val="19"/>
+                <w:szCs w:val="19"/>
+              </w:rPr>
+              <w:t xml:space="preserve">+0</w:t>
+            </w:r>
+          </w:p>
+        </w:tc>
+      </w:tr>
+      <w:tr>
+        <w:tc>
+          <w:tcPr>
+            <w:tcW w:type="dxa" w:w="4200"/>
+            <w:shd w:fill="F2F5F9" w:color="auto" w:val="clear"/>
+            <w:tcMar>
+              <w:top w:type="dxa" w:w="60"/>
+              <w:left w:type="dxa" w:w="100"/>
+              <w:bottom w:type="dxa" w:w="60"/>
+              <w:right w:type="dxa" w:w="100"/>
+            </w:tcMar>
+          </w:tcPr>
+          <w:p>
+            <w:pPr>
+              <w:spacing w:after="0"/>
+            </w:pPr>
+            <w:r>
+              <w:rPr>
+                <w:rFonts w:ascii="Calibri" w:cs="Calibri" w:eastAsia="Calibri" w:hAnsi="Calibri"/>
+                <w:sz w:val="19"/>
+                <w:szCs w:val="19"/>
+              </w:rPr>
+              <w:t xml:space="preserve">Idle 120 s</w:t>
+            </w:r>
+          </w:p>
+        </w:tc>
+        <w:tc>
+          <w:tcPr>
+            <w:tcW w:type="dxa" w:w="3600"/>
+            <w:shd w:fill="F2F5F9" w:color="auto" w:val="clear"/>
+            <w:tcMar>
+              <w:top w:type="dxa" w:w="60"/>
+              <w:left w:type="dxa" w:w="100"/>
+              <w:bottom w:type="dxa" w:w="60"/>
+              <w:right w:type="dxa" w:w="100"/>
+            </w:tcMar>
+          </w:tcPr>
+          <w:p>
+            <w:pPr>
+              <w:spacing w:after="0"/>
+            </w:pPr>
+            <w:r>
+              <w:rPr>
+                <w:rFonts w:ascii="Calibri" w:cs="Calibri" w:eastAsia="Calibri" w:hAnsi="Calibri"/>
+                <w:sz w:val="19"/>
+                <w:szCs w:val="19"/>
+              </w:rPr>
+              <w:t xml:space="preserve">45,475</w:t>
+            </w:r>
+          </w:p>
+        </w:tc>
+        <w:tc>
+          <w:tcPr>
+            <w:tcW w:type="dxa" w:w="2280"/>
+            <w:shd w:fill="F2F5F9" w:color="auto" w:val="clear"/>
+            <w:tcMar>
+              <w:top w:type="dxa" w:w="60"/>
+              <w:left w:type="dxa" w:w="100"/>
+              <w:bottom w:type="dxa" w:w="60"/>
+              <w:right w:type="dxa" w:w="100"/>
+            </w:tcMar>
+          </w:tcPr>
+          <w:p>
+            <w:pPr>
+              <w:spacing w:after="0"/>
+            </w:pPr>
+            <w:r>
+              <w:rPr>
+                <w:rFonts w:ascii="Calibri" w:cs="Calibri" w:eastAsia="Calibri" w:hAnsi="Calibri"/>
+                <w:sz w:val="19"/>
+                <w:szCs w:val="19"/>
+              </w:rPr>
+              <w:t xml:space="preserve">-1</w:t>
+            </w:r>
+          </w:p>
+        </w:tc>
+      </w:tr>
+    </w:tbl>
+    <w:p>
+      <w:pPr>
+        <w:spacing w:after="80" w:before="0"/>
+      </w:pPr>
+      <w:r>
+        <w:rPr>
+          <w:rFonts w:ascii="Calibri" w:cs="Calibri" w:eastAsia="Calibri" w:hAnsi="Calibri"/>
+          <w:sz w:val="22"/>
+          <w:szCs w:val="22"/>
+        </w:rPr>
+        <w:t xml:space="preserve"/>
+      </w:r>
+    </w:p>
+    <w:p>
+      <w:pPr>
+        <w:spacing w:after="60" w:before="120"/>
+        <w:jc w:val="center"/>
+      </w:pPr>
+      <w:r>
+        <w:drawing>
+          <wp:inline distT="0" distB="0" distL="0" distR="0">
+            <wp:extent cx="5524500" cy="1990725"/>
+            <wp:effectExtent t="0" r="0" b="0" l="0"/>
+            <wp:docPr id="4" name=""/>
+            <wp:cNvGraphicFramePr>
+              <a:graphicFrameLocks xmlns:a="http://schemas.openxmlformats.org/drawingml/2006/main" noChangeAspect="1"/>
+            </wp:cNvGraphicFramePr>
+            <a:graphic xmlns:a="http://schemas.openxmlformats.org/drawingml/2006/main">
+              <a:graphicData uri="http://schemas.openxmlformats.org/drawingml/2006/picture">
+                <pic:pic xmlns:pic="http://schemas.openxmlformats.org/drawingml/2006/picture">
+                  <pic:nvPicPr>
+                    <pic:cNvPr id="0" name="" descr=""/>
+                    <pic:cNvPicPr>
+                      <a:picLocks noChangeAspect="1" noChangeArrowheads="1"/>
+                    </pic:cNvPicPr>
+                  </pic:nvPicPr>
+                  <pic:blipFill>
+                    <a:blip r:embed="rId12" cstate="none"/>
+                    <a:srcRect/>
+                    <a:stretch>
+                      <a:fillRect/>
+                    </a:stretch>
+                  </pic:blipFill>
+                  <pic:spPr bwMode="auto">
+                    <a:xfrm>
+                      <a:off x="0" y="0"/>
+                      <a:ext cx="5524500" cy="1990725"/>
+                    </a:xfrm>
+                    <a:prstGeom prst="rect">
+                      <a:avLst/>
+                    </a:prstGeom>
+                  </pic:spPr>
+                </pic:pic>
+              </a:graphicData>
+            </a:graphic>
+          </wp:inline>
+        </w:drawing>
+      </w:r>
+    </w:p>
+    <w:p>
+      <w:pPr>
+        <w:spacing w:after="240" w:before="0"/>
+        <w:jc w:val="center"/>
+      </w:pPr>
+      <w:r>
+        <w:rPr>
+          <w:rFonts w:ascii="Calibri" w:cs="Calibri" w:eastAsia="Calibri" w:hAnsi="Calibri"/>
+          <w:i/>
+          <w:iCs/>
+          <w:color w:val="595959"/>
+          <w:sz w:val="19"/>
+          <w:szCs w:val="19"/>
+        </w:rPr>
+        <w:t xml:space="preserve">Figure 5. The same test as a timeline: the counter is flat through the searches.</w:t>
+      </w:r>
+    </w:p>
+    <w:tbl>
+      <w:tblPr>
+        <w:tblW w:type="dxa" w:w="10080"/>
+        <w:tblBorders>
+          <w:top w:val="single" w:color="auto" w:sz="4"/>
+          <w:left w:val="single" w:color="auto" w:sz="4"/>
+          <w:bottom w:val="single" w:color="auto" w:sz="4"/>
+          <w:right w:val="single" w:color="auto" w:sz="4"/>
+          <w:insideH w:val="single" w:color="auto" w:sz="4"/>
+          <w:insideV w:val="single" w:color="auto" w:sz="4"/>
+        </w:tblBorders>
+        <w:tblLayout w:type="fixed"/>
+      </w:tblPr>
+      <w:tblGrid>
+        <w:gridCol w:w="10080"/>
+      </w:tblGrid>
+      <w:tr>
+        <w:tc>
+          <w:tcPr>
+            <w:tcW w:type="dxa" w:w="10080"/>
+            <w:shd w:fill="E6F4EA" w:color="auto" w:val="clear"/>
+            <w:tcMar>
+              <w:top w:type="dxa" w:w="120"/>
+              <w:left w:type="dxa" w:w="160"/>
+              <w:bottom w:type="dxa" w:w="120"/>
+              <w:right w:type="dxa" w:w="160"/>
+            </w:tcMar>
+          </w:tcPr>
+          <w:p>
+            <w:pPr>
+              <w:spacing w:after="80"/>
+            </w:pPr>
+            <w:r>
+              <w:rPr>
+                <w:rFonts w:ascii="Calibri" w:cs="Calibri" w:eastAsia="Calibri" w:hAnsi="Calibri"/>
+                <w:b/>
+                <w:bCs/>
+                <w:sz w:val="23"/>
+                <w:szCs w:val="23"/>
+              </w:rPr>
+              <w:t xml:space="preserve">Result: search is free</w:t>
+            </w:r>
+          </w:p>
+          <w:p>
+            <w:pPr>
+              <w:spacing w:after="60"/>
+            </w:pPr>
+            <w:r>
+              <w:rPr>
+                <w:rFonts w:ascii="Calibri" w:cs="Calibri" w:eastAsia="Calibri" w:hAnsi="Calibri"/>
+                <w:sz w:val="21"/>
+                <w:szCs w:val="21"/>
+              </w:rPr>
+              <w:t xml:space="preserve">Ten searches covering 1,000 people moved the credit counter by zero at the 150-second reading, and the counter then went down by 1 during the final idle period, which can only be an adjustment or refund elsewhere on the shared account, not a charge for our searches. Compare that with the unlock test earlier in the day, where 15 unlocks moved it by exactly 15. Searching and counting is free; revealing a person is what costs.</w:t>
+            </w:r>
+          </w:p>
+          <w:p>
+            <w:pPr>
+              <w:spacing w:after="60"/>
+            </w:pPr>
+            <w:r>
+              <w:rPr>
+                <w:rFonts w:ascii="Calibri" w:cs="Calibri" w:eastAsia="Calibri" w:hAnsi="Calibri"/>
+                <w:sz w:val="21"/>
+                <w:szCs w:val="21"/>
+              </w:rPr>
+              <w:t xml:space="preserve">Note for the shared account: during the same afternoon the counter also moved by 87 credits while this project made no paid calls at all, so other users of the Apollo team account were active. That is why every measurement here is bracketed by idle readings.</w:t>
+            </w:r>
+          </w:p>
+        </w:tc>
+      </w:tr>
+    </w:tbl>
+    <w:p>
+      <w:pPr>
+        <w:pStyle w:val="Heading2"/>
+        <w:spacing w:after="120" w:before="240"/>
+      </w:pPr>
+      <w:bookmarkStart w:name="_Toc18" w:id="18"/>
+      <w:r>
+        <w:rPr>
+          <w:rFonts w:ascii="Calibri" w:cs="Calibri" w:eastAsia="Calibri" w:hAnsi="Calibri"/>
+          <w:b/>
+          <w:bCs/>
+          <w:color w:val="1F3A5F"/>
+          <w:sz w:val="26"/>
+          <w:szCs w:val="26"/>
+        </w:rPr>
+        <w:t xml:space="preserve">6.7 What else was measured, for completeness</w:t>
+      </w:r>
+      <w:bookmarkEnd w:id="18"/>
+    </w:p>
+    <w:tbl>
+      <w:tblPr>
+        <w:tblW w:type="dxa" w:w="10080"/>
+        <w:tblBorders>
+          <w:top w:val="single" w:color="auto" w:sz="4"/>
+          <w:left w:val="single" w:color="auto" w:sz="4"/>
+          <w:bottom w:val="single" w:color="auto" w:sz="4"/>
+          <w:right w:val="single" w:color="auto" w:sz="4"/>
+          <w:insideH w:val="single" w:color="auto" w:sz="4"/>
+          <w:insideV w:val="single" w:color="auto" w:sz="4"/>
+        </w:tblBorders>
+        <w:tblLayout w:type="fixed"/>
+      </w:tblPr>
+      <w:tblGrid>
+        <w:gridCol w:w="2600"/>
+        <w:gridCol w:w="4200"/>
+        <w:gridCol w:w="3280"/>
+      </w:tblGrid>
+      <w:tr>
+        <w:trPr>
+          <w:tblHeader/>
+        </w:trPr>
+        <w:tc>
+          <w:tcPr>
+            <w:tcW w:type="dxa" w:w="2600"/>
+            <w:shd w:fill="1F3A5F" w:color="auto" w:val="clear"/>
+            <w:tcMar>
+              <w:top w:type="dxa" w:w="60"/>
+              <w:left w:type="dxa" w:w="100"/>
+              <w:bottom w:type="dxa" w:w="60"/>
+              <w:right w:type="dxa" w:w="100"/>
+            </w:tcMar>
+          </w:tcPr>
+          <w:p>
+            <w:pPr>
+              <w:spacing w:after="0"/>
+            </w:pPr>
+            <w:r>
+              <w:rPr>
+                <w:rFonts w:ascii="Calibri" w:cs="Calibri" w:eastAsia="Calibri" w:hAnsi="Calibri"/>
+                <w:b/>
+                <w:bCs/>
+                <w:color w:val="FFFFFF"/>
+                <w:sz w:val="19"/>
+                <w:szCs w:val="19"/>
+              </w:rPr>
+              <w:t xml:space="preserve">Apollo call</w:t>
+            </w:r>
+          </w:p>
+        </w:tc>
+        <w:tc>
+          <w:tcPr>
+            <w:tcW w:type="dxa" w:w="4200"/>
+            <w:shd w:fill="1F3A5F" w:color="auto" w:val="clear"/>
+            <w:tcMar>
+              <w:top w:type="dxa" w:w="60"/>
+              <w:left w:type="dxa" w:w="100"/>
+              <w:bottom w:type="dxa" w:w="60"/>
+              <w:right w:type="dxa" w:w="100"/>
+            </w:tcMar>
+          </w:tcPr>
+          <w:p>
+            <w:pPr>
+              <w:spacing w:after="0"/>
+            </w:pPr>
+            <w:r>
+              <w:rPr>
+                <w:rFonts w:ascii="Calibri" w:cs="Calibri" w:eastAsia="Calibri" w:hAnsi="Calibri"/>
+                <w:b/>
+                <w:bCs/>
+                <w:color w:val="FFFFFF"/>
+                <w:sz w:val="19"/>
+                <w:szCs w:val="19"/>
+              </w:rPr>
+              <w:t xml:space="preserve">What it gives you</w:t>
+            </w:r>
+          </w:p>
+        </w:tc>
+        <w:tc>
+          <w:tcPr>
+            <w:tcW w:type="dxa" w:w="3280"/>
+            <w:shd w:fill="1F3A5F" w:color="auto" w:val="clear"/>
+            <w:tcMar>
+              <w:top w:type="dxa" w:w="60"/>
+              <w:left w:type="dxa" w:w="100"/>
+              <w:bottom w:type="dxa" w:w="60"/>
+              <w:right w:type="dxa" w:w="100"/>
+            </w:tcMar>
+          </w:tcPr>
+          <w:p>
+            <w:pPr>
+              <w:spacing w:after="0"/>
+            </w:pPr>
+            <w:r>
+              <w:rPr>
+                <w:rFonts w:ascii="Calibri" w:cs="Calibri" w:eastAsia="Calibri" w:hAnsi="Calibri"/>
+                <w:b/>
+                <w:bCs/>
+                <w:color w:val="FFFFFF"/>
+                <w:sz w:val="19"/>
+                <w:szCs w:val="19"/>
+              </w:rPr>
+              <w:t xml:space="preserve">Measured cost</w:t>
+            </w:r>
+          </w:p>
+        </w:tc>
+      </w:tr>
+      <w:tr>
+        <w:tc>
+          <w:tcPr>
+            <w:tcW w:type="dxa" w:w="2600"/>
+            <w:tcMar>
+              <w:top w:type="dxa" w:w="60"/>
+              <w:left w:type="dxa" w:w="100"/>
+              <w:bottom w:type="dxa" w:w="60"/>
+              <w:right w:type="dxa" w:w="100"/>
+            </w:tcMar>
+          </w:tcPr>
+          <w:p>
+            <w:pPr>
+              <w:spacing w:after="0"/>
+            </w:pPr>
+            <w:r>
+              <w:rPr>
+                <w:rFonts w:ascii="Calibri" w:cs="Calibri" w:eastAsia="Calibri" w:hAnsi="Calibri"/>
+                <w:sz w:val="19"/>
+                <w:szCs w:val="19"/>
+              </w:rPr>
+              <w:t xml:space="preserve">People search (api_search)</w:t>
+            </w:r>
+          </w:p>
+        </w:tc>
+        <w:tc>
+          <w:tcPr>
+            <w:tcW w:type="dxa" w:w="4200"/>
+            <w:tcMar>
+              <w:top w:type="dxa" w:w="60"/>
+              <w:left w:type="dxa" w:w="100"/>
+              <w:bottom w:type="dxa" w:w="60"/>
+              <w:right w:type="dxa" w:w="100"/>
+            </w:tcMar>
+          </w:tcPr>
+          <w:p>
+            <w:pPr>
+              <w:spacing w:after="0"/>
+            </w:pPr>
+            <w:r>
+              <w:rPr>
+                <w:rFonts w:ascii="Calibri" w:cs="Calibri" w:eastAsia="Calibri" w:hAnsi="Calibri"/>
+                <w:sz w:val="19"/>
+                <w:szCs w:val="19"/>
+              </w:rPr>
+              <w:t xml:space="preserve">Count of matches plus first name, masked last name, title, company name, has-email flag</w:t>
+            </w:r>
+          </w:p>
+        </w:tc>
+        <w:tc>
+          <w:tcPr>
+            <w:tcW w:type="dxa" w:w="3280"/>
+            <w:tcMar>
+              <w:top w:type="dxa" w:w="60"/>
+              <w:left w:type="dxa" w:w="100"/>
+              <w:bottom w:type="dxa" w:w="60"/>
+              <w:right w:type="dxa" w:w="100"/>
+            </w:tcMar>
+          </w:tcPr>
+          <w:p>
+            <w:pPr>
+              <w:spacing w:after="0"/>
+            </w:pPr>
+            <w:r>
+              <w:rPr>
+                <w:rFonts w:ascii="Calibri" w:cs="Calibri" w:eastAsia="Calibri" w:hAnsi="Calibri"/>
+                <w:sz w:val="19"/>
+                <w:szCs w:val="19"/>
+              </w:rPr>
+              <w:t xml:space="preserve">0 credits</w:t>
+            </w:r>
+          </w:p>
+        </w:tc>
+      </w:tr>
+      <w:tr>
+        <w:tc>
+          <w:tcPr>
+            <w:tcW w:type="dxa" w:w="2600"/>
+            <w:shd w:fill="F2F5F9" w:color="auto" w:val="clear"/>
+            <w:tcMar>
+              <w:top w:type="dxa" w:w="60"/>
+              <w:left w:type="dxa" w:w="100"/>
+              <w:bottom w:type="dxa" w:w="60"/>
+              <w:right w:type="dxa" w:w="100"/>
+            </w:tcMar>
+          </w:tcPr>
+          <w:p>
+            <w:pPr>
+              <w:spacing w:after="0"/>
+            </w:pPr>
+            <w:r>
+              <w:rPr>
+                <w:rFonts w:ascii="Calibri" w:cs="Calibri" w:eastAsia="Calibri" w:hAnsi="Calibri"/>
+                <w:sz w:val="19"/>
+                <w:szCs w:val="19"/>
+              </w:rPr>
+              <w:t xml:space="preserve">People unlock (people/match, bulk_match)</w:t>
+            </w:r>
+          </w:p>
+        </w:tc>
+        <w:tc>
+          <w:tcPr>
+            <w:tcW w:type="dxa" w:w="4200"/>
+            <w:shd w:fill="F2F5F9" w:color="auto" w:val="clear"/>
+            <w:tcMar>
+              <w:top w:type="dxa" w:w="60"/>
+              <w:left w:type="dxa" w:w="100"/>
+              <w:bottom w:type="dxa" w:w="60"/>
+              <w:right w:type="dxa" w:w="100"/>
+            </w:tcMar>
+          </w:tcPr>
+          <w:p>
+            <w:pPr>
+              <w:spacing w:after="0"/>
+            </w:pPr>
+            <w:r>
+              <w:rPr>
+                <w:rFonts w:ascii="Calibri" w:cs="Calibri" w:eastAsia="Calibri" w:hAnsi="Calibri"/>
+                <w:sz w:val="19"/>
+                <w:szCs w:val="19"/>
+              </w:rPr>
+              <w:t xml:space="preserve">Email, email status, LinkedIn URL, location, company industry and size</w:t>
+            </w:r>
+          </w:p>
+        </w:tc>
+        <w:tc>
+          <w:tcPr>
+            <w:tcW w:type="dxa" w:w="3280"/>
+            <w:shd w:fill="F2F5F9" w:color="auto" w:val="clear"/>
+            <w:tcMar>
+              <w:top w:type="dxa" w:w="60"/>
+              <w:left w:type="dxa" w:w="100"/>
+              <w:bottom w:type="dxa" w:w="60"/>
+              <w:right w:type="dxa" w:w="100"/>
+            </w:tcMar>
+          </w:tcPr>
+          <w:p>
+            <w:pPr>
+              <w:spacing w:after="0"/>
+            </w:pPr>
+            <w:r>
+              <w:rPr>
+                <w:rFonts w:ascii="Calibri" w:cs="Calibri" w:eastAsia="Calibri" w:hAnsi="Calibri"/>
+                <w:sz w:val="19"/>
+                <w:szCs w:val="19"/>
+              </w:rPr>
+              <w:t xml:space="preserve">1 credit per person, also when no email comes back, also for a repeat</w:t>
+            </w:r>
+          </w:p>
+        </w:tc>
+      </w:tr>
+      <w:tr>
+        <w:tc>
+          <w:tcPr>
+            <w:tcW w:type="dxa" w:w="2600"/>
+            <w:tcMar>
+              <w:top w:type="dxa" w:w="60"/>
+              <w:left w:type="dxa" w:w="100"/>
+              <w:bottom w:type="dxa" w:w="60"/>
+              <w:right w:type="dxa" w:w="100"/>
+            </w:tcMar>
+          </w:tcPr>
+          <w:p>
+            <w:pPr>
+              <w:spacing w:after="0"/>
+            </w:pPr>
+            <w:r>
+              <w:rPr>
+                <w:rFonts w:ascii="Calibri" w:cs="Calibri" w:eastAsia="Calibri" w:hAnsi="Calibri"/>
+                <w:sz w:val="19"/>
+                <w:szCs w:val="19"/>
+              </w:rPr>
+              <w:t xml:space="preserve">Company enrichment (organizations/enrich)</w:t>
+            </w:r>
+          </w:p>
+        </w:tc>
+        <w:tc>
+          <w:tcPr>
+            <w:tcW w:type="dxa" w:w="4200"/>
+            <w:tcMar>
+              <w:top w:type="dxa" w:w="60"/>
+              <w:left w:type="dxa" w:w="100"/>
+              <w:bottom w:type="dxa" w:w="60"/>
+              <w:right w:type="dxa" w:w="100"/>
+            </w:tcMar>
+          </w:tcPr>
+          <w:p>
+            <w:pPr>
+              <w:spacing w:after="0"/>
+            </w:pPr>
+            <w:r>
+              <w:rPr>
+                <w:rFonts w:ascii="Calibri" w:cs="Calibri" w:eastAsia="Calibri" w:hAnsi="Calibri"/>
+                <w:sz w:val="19"/>
+                <w:szCs w:val="19"/>
+              </w:rPr>
+              <w:t xml:space="preserve">Industry, size, revenue, description, keywords, tech stack, funding, headcount growth</w:t>
+            </w:r>
+          </w:p>
+        </w:tc>
+        <w:tc>
+          <w:tcPr>
+            <w:tcW w:type="dxa" w:w="3280"/>
+            <w:tcMar>
+              <w:top w:type="dxa" w:w="60"/>
+              <w:left w:type="dxa" w:w="100"/>
+              <w:bottom w:type="dxa" w:w="60"/>
+              <w:right w:type="dxa" w:w="100"/>
+            </w:tcMar>
+          </w:tcPr>
+          <w:p>
+            <w:pPr>
+              <w:spacing w:after="0"/>
+            </w:pPr>
+            <w:r>
+              <w:rPr>
+                <w:rFonts w:ascii="Calibri" w:cs="Calibri" w:eastAsia="Calibri" w:hAnsi="Calibri"/>
+                <w:sz w:val="19"/>
+                <w:szCs w:val="19"/>
+              </w:rPr>
+              <w:t xml:space="preserve">1 credit per company</w:t>
+            </w:r>
+          </w:p>
+        </w:tc>
+      </w:tr>
+      <w:tr>
+        <w:tc>
+          <w:tcPr>
+            <w:tcW w:type="dxa" w:w="2600"/>
+            <w:shd w:fill="F2F5F9" w:color="auto" w:val="clear"/>
+            <w:tcMar>
+              <w:top w:type="dxa" w:w="60"/>
+              <w:left w:type="dxa" w:w="100"/>
+              <w:bottom w:type="dxa" w:w="60"/>
+              <w:right w:type="dxa" w:w="100"/>
+            </w:tcMar>
+          </w:tcPr>
+          <w:p>
+            <w:pPr>
+              <w:spacing w:after="0"/>
+            </w:pPr>
+            <w:r>
+              <w:rPr>
+                <w:rFonts w:ascii="Calibri" w:cs="Calibri" w:eastAsia="Calibri" w:hAnsi="Calibri"/>
+                <w:sz w:val="19"/>
+                <w:szCs w:val="19"/>
+              </w:rPr>
+              <w:t xml:space="preserve">Company job postings</w:t>
+            </w:r>
+          </w:p>
+        </w:tc>
+        <w:tc>
+          <w:tcPr>
+            <w:tcW w:type="dxa" w:w="4200"/>
+            <w:shd w:fill="F2F5F9" w:color="auto" w:val="clear"/>
+            <w:tcMar>
+              <w:top w:type="dxa" w:w="60"/>
+              <w:left w:type="dxa" w:w="100"/>
+              <w:bottom w:type="dxa" w:w="60"/>
+              <w:right w:type="dxa" w:w="100"/>
+            </w:tcMar>
+          </w:tcPr>
+          <w:p>
+            <w:pPr>
+              <w:spacing w:after="0"/>
+            </w:pPr>
+            <w:r>
+              <w:rPr>
+                <w:rFonts w:ascii="Calibri" w:cs="Calibri" w:eastAsia="Calibri" w:hAnsi="Calibri"/>
+                <w:sz w:val="19"/>
+                <w:szCs w:val="19"/>
+              </w:rPr>
+              <w:t xml:space="preserve">Open roles at a company (hiring signal)</w:t>
+            </w:r>
+          </w:p>
+        </w:tc>
+        <w:tc>
+          <w:tcPr>
+            <w:tcW w:type="dxa" w:w="3280"/>
+            <w:shd w:fill="F2F5F9" w:color="auto" w:val="clear"/>
+            <w:tcMar>
+              <w:top w:type="dxa" w:w="60"/>
+              <w:left w:type="dxa" w:w="100"/>
+              <w:bottom w:type="dxa" w:w="60"/>
+              <w:right w:type="dxa" w:w="100"/>
+            </w:tcMar>
+          </w:tcPr>
+          <w:p>
+            <w:pPr>
+              <w:spacing w:after="0"/>
+            </w:pPr>
+            <w:r>
+              <w:rPr>
+                <w:rFonts w:ascii="Calibri" w:cs="Calibri" w:eastAsia="Calibri" w:hAnsi="Calibri"/>
+                <w:sz w:val="19"/>
+                <w:szCs w:val="19"/>
+              </w:rPr>
+              <w:t xml:space="preserve">1 credit per call</w:t>
+            </w:r>
+          </w:p>
+        </w:tc>
+      </w:tr>
+      <w:tr>
+        <w:tc>
+          <w:tcPr>
+            <w:tcW w:type="dxa" w:w="2600"/>
+            <w:tcMar>
+              <w:top w:type="dxa" w:w="60"/>
+              <w:left w:type="dxa" w:w="100"/>
+              <w:bottom w:type="dxa" w:w="60"/>
+              <w:right w:type="dxa" w:w="100"/>
+            </w:tcMar>
+          </w:tcPr>
+          <w:p>
+            <w:pPr>
+              <w:spacing w:after="0"/>
+            </w:pPr>
+            <w:r>
+              <w:rPr>
+                <w:rFonts w:ascii="Calibri" w:cs="Calibri" w:eastAsia="Calibri" w:hAnsi="Calibri"/>
+                <w:sz w:val="19"/>
+                <w:szCs w:val="19"/>
+              </w:rPr>
+              <w:t xml:space="preserve">Company search (mixed_companies/search)</w:t>
+            </w:r>
+          </w:p>
+        </w:tc>
+        <w:tc>
+          <w:tcPr>
+            <w:tcW w:type="dxa" w:w="4200"/>
+            <w:tcMar>
+              <w:top w:type="dxa" w:w="60"/>
+              <w:left w:type="dxa" w:w="100"/>
+              <w:bottom w:type="dxa" w:w="60"/>
+              <w:right w:type="dxa" w:w="100"/>
+            </w:tcMar>
+          </w:tcPr>
+          <w:p>
+            <w:pPr>
+              <w:spacing w:after="0"/>
+            </w:pPr>
+            <w:r>
+              <w:rPr>
+                <w:rFonts w:ascii="Calibri" w:cs="Calibri" w:eastAsia="Calibri" w:hAnsi="Calibri"/>
+                <w:sz w:val="19"/>
+                <w:szCs w:val="19"/>
+              </w:rPr>
+              <w:t xml:space="preserve">Should list companies; returned none on this plan</w:t>
+            </w:r>
+          </w:p>
+        </w:tc>
+        <w:tc>
+          <w:tcPr>
+            <w:tcW w:type="dxa" w:w="3280"/>
+            <w:tcMar>
+              <w:top w:type="dxa" w:w="60"/>
+              <w:left w:type="dxa" w:w="100"/>
+              <w:bottom w:type="dxa" w:w="60"/>
+              <w:right w:type="dxa" w:w="100"/>
+            </w:tcMar>
+          </w:tcPr>
+          <w:p>
+            <w:pPr>
+              <w:spacing w:after="0"/>
+            </w:pPr>
+            <w:r>
+              <w:rPr>
+                <w:rFonts w:ascii="Calibri" w:cs="Calibri" w:eastAsia="Calibri" w:hAnsi="Calibri"/>
+                <w:sz w:val="19"/>
+                <w:szCs w:val="19"/>
+              </w:rPr>
+              <w:t xml:space="preserve">1 credit per call, not worth using</w:t>
+            </w:r>
+          </w:p>
+        </w:tc>
+      </w:tr>
+      <w:tr>
+        <w:tc>
+          <w:tcPr>
+            <w:tcW w:type="dxa" w:w="2600"/>
+            <w:shd w:fill="F2F5F9" w:color="auto" w:val="clear"/>
+            <w:tcMar>
+              <w:top w:type="dxa" w:w="60"/>
+              <w:left w:type="dxa" w:w="100"/>
+              <w:bottom w:type="dxa" w:w="60"/>
+              <w:right w:type="dxa" w:w="100"/>
+            </w:tcMar>
+          </w:tcPr>
+          <w:p>
+            <w:pPr>
+              <w:spacing w:after="0"/>
+            </w:pPr>
+            <w:r>
+              <w:rPr>
+                <w:rFonts w:ascii="Calibri" w:cs="Calibri" w:eastAsia="Calibri" w:hAnsi="Calibri"/>
+                <w:sz w:val="19"/>
+                <w:szCs w:val="19"/>
+              </w:rPr>
+              <w:t xml:space="preserve">Usage and credit stats</w:t>
+            </w:r>
+          </w:p>
+        </w:tc>
+        <w:tc>
+          <w:tcPr>
+            <w:tcW w:type="dxa" w:w="4200"/>
+            <w:shd w:fill="F2F5F9" w:color="auto" w:val="clear"/>
+            <w:tcMar>
+              <w:top w:type="dxa" w:w="60"/>
+              <w:left w:type="dxa" w:w="100"/>
+              <w:bottom w:type="dxa" w:w="60"/>
+              <w:right w:type="dxa" w:w="100"/>
+            </w:tcMar>
+          </w:tcPr>
+          <w:p>
+            <w:pPr>
+              <w:spacing w:after="0"/>
+            </w:pPr>
+            <w:r>
+              <w:rPr>
+                <w:rFonts w:ascii="Calibri" w:cs="Calibri" w:eastAsia="Calibri" w:hAnsi="Calibri"/>
+                <w:sz w:val="19"/>
+                <w:szCs w:val="19"/>
+              </w:rPr>
+              <w:t xml:space="preserve">Rate limits and the credit counter used for every measurement here</w:t>
+            </w:r>
+          </w:p>
+        </w:tc>
+        <w:tc>
+          <w:tcPr>
+            <w:tcW w:type="dxa" w:w="3280"/>
+            <w:shd w:fill="F2F5F9" w:color="auto" w:val="clear"/>
+            <w:tcMar>
+              <w:top w:type="dxa" w:w="60"/>
+              <w:left w:type="dxa" w:w="100"/>
+              <w:bottom w:type="dxa" w:w="60"/>
+              <w:right w:type="dxa" w:w="100"/>
+            </w:tcMar>
+          </w:tcPr>
+          <w:p>
+            <w:pPr>
+              <w:spacing w:after="0"/>
+            </w:pPr>
+            <w:r>
+              <w:rPr>
+                <w:rFonts w:ascii="Calibri" w:cs="Calibri" w:eastAsia="Calibri" w:hAnsi="Calibri"/>
+                <w:sz w:val="19"/>
+                <w:szCs w:val="19"/>
+              </w:rPr>
+              <w:t xml:space="preserve">0 credits</w:t>
+            </w:r>
+          </w:p>
+        </w:tc>
+      </w:tr>
+    </w:tbl>
+    <w:p>
+      <w:r>
+        <w:br w:type="page"/>
+      </w:r>
+    </w:p>
+    <w:p>
+      <w:pPr>
+        <w:pStyle w:val="Heading1"/>
+        <w:spacing w:after="160" w:before="360"/>
+      </w:pPr>
+      <w:bookmarkStart w:name="_Toc19" w:id="19"/>
+      <w:r>
+        <w:rPr>
+          <w:rFonts w:ascii="Calibri" w:cs="Calibri" w:eastAsia="Calibri" w:hAnsi="Calibri"/>
+          <w:b/>
+          <w:bCs/>
+          <w:color w:val="1F3A5F"/>
+          <w:sz w:val="32"/>
+          <w:szCs w:val="32"/>
+        </w:rPr>
+        <w:t xml:space="preserve">7. Evidence from the run</w:t>
+      </w:r>
+      <w:bookmarkEnd w:id="19"/>
+    </w:p>
+    <w:p>
+      <w:pPr>
+        <w:pStyle w:val="Heading2"/>
+        <w:spacing w:after="120" w:before="240"/>
+      </w:pPr>
+      <w:bookmarkStart w:name="_Toc20" w:id="20"/>
+      <w:r>
+        <w:rPr>
+          <w:rFonts w:ascii="Calibri" w:cs="Calibri" w:eastAsia="Calibri" w:hAnsi="Calibri"/>
+          <w:b/>
+          <w:bCs/>
+          <w:color w:val="1F3A5F"/>
+          <w:sz w:val="26"/>
+          <w:szCs w:val="26"/>
+        </w:rPr>
+        <w:t xml:space="preserve">7.1 Server log events</w:t>
+      </w:r>
+      <w:bookmarkEnd w:id="20"/>
+    </w:p>
+    <w:p>
+      <w:pPr>
+        <w:shd w:fill="F3F3F3" w:color="auto" w:val="clear"/>
+        <w:spacing w:after="40"/>
+        <w:ind w:left="200"/>
+      </w:pPr>
+      <w:r>
+        <w:rPr>
+          <w:rFonts w:ascii="Consolas" w:cs="Consolas" w:eastAsia="Consolas" w:hAnsi="Consolas"/>
+          <w:sz w:val="18"/>
+          <w:szCs w:val="18"/>
+        </w:rPr>
+        <w:t xml:space="preserve">{"event":"apollo_variant_attempt","level":0,"label":"exact AI filters","totalEntries":3895,"pagePeople":100,"params":{"tags":["fintech"],"q":null,"size":["11,50"],"titles":["Founde</w:t>
+      </w:r>
+    </w:p>
+    <w:p>
+      <w:pPr>
+        <w:shd w:fill="F3F3F3" w:color="auto" w:val="clear"/>
+        <w:spacing w:after="40"/>
+        <w:ind w:left="200"/>
+      </w:pPr>
+      <w:r>
+        <w:rPr>
+          <w:rFonts w:ascii="Consolas" w:cs="Consolas" w:eastAsia="Consolas" w:hAnsi="Consolas"/>
+          <w:sz w:val="18"/>
+          <w:szCs w:val="18"/>
+        </w:rPr>
+        <w:t xml:space="preserve">{"event":"apollo_variant_selected","level":0,"label":"exact AI filters","totalEntries":3895,"relaxed":false}</w:t>
+      </w:r>
+    </w:p>
+    <w:p>
+      <w:pPr>
+        <w:shd w:fill="F3F3F3" w:color="auto" w:val="clear"/>
+        <w:spacing w:after="40"/>
+        <w:ind w:left="200"/>
+      </w:pPr>
+      <w:r>
+        <w:rPr>
+          <w:rFonts w:ascii="Consolas" w:cs="Consolas" w:eastAsia="Consolas" w:hAnsi="Consolas"/>
+          <w:sz w:val="18"/>
+          <w:szCs w:val="18"/>
+        </w:rPr>
+        <w:t xml:space="preserve">{"event":"prescreen","candidates":100,"passed":94,"dropped":6,"minScore":60,"durationMs":31208}</w:t>
+      </w:r>
+    </w:p>
+    <w:p>
+      <w:pPr>
+        <w:shd w:fill="F3F3F3" w:color="auto" w:val="clear"/>
+        <w:spacing w:after="40"/>
+        <w:ind w:left="200"/>
+      </w:pPr>
+      <w:r>
+        <w:rPr>
+          <w:rFonts w:ascii="Consolas" w:cs="Consolas" w:eastAsia="Consolas" w:hAnsi="Consolas"/>
+          <w:sz w:val="18"/>
+          <w:szCs w:val="18"/>
+        </w:rPr>
+        <w:t xml:space="preserve">{"event":"stage_chunk_summary","stage":"unlock","people":30,"unlockedEmail":10,"chunkFailures":0,"chunkCount":1,"medianMs":1777,"p95Ms":1777,"maxMs":1777,"revealPersonal":false,"st</w:t>
+      </w:r>
+    </w:p>
+    <w:p>
+      <w:pPr>
+        <w:shd w:fill="F3F3F3" w:color="auto" w:val="clear"/>
+        <w:spacing w:after="40"/>
+        <w:ind w:left="200"/>
+      </w:pPr>
+      <w:r>
+        <w:rPr>
+          <w:rFonts w:ascii="Consolas" w:cs="Consolas" w:eastAsia="Consolas" w:hAnsi="Consolas"/>
+          <w:sz w:val="18"/>
+          <w:szCs w:val="18"/>
+        </w:rPr>
+        <w:t xml:space="preserve">{"event":"contact_pool_saved","saved":10}</w:t>
+      </w:r>
+    </w:p>
+    <w:p>
+      <w:pPr>
+        <w:shd w:fill="F3F3F3" w:color="auto" w:val="clear"/>
+        <w:spacing w:after="40"/>
+        <w:ind w:left="200"/>
+      </w:pPr>
+      <w:r>
+        <w:rPr>
+          <w:rFonts w:ascii="Consolas" w:cs="Consolas" w:eastAsia="Consolas" w:hAnsi="Consolas"/>
+          <w:sz w:val="18"/>
+          <w:szCs w:val="18"/>
+        </w:rPr>
+        <w:t xml:space="preserve">{"event":"postcheck","candidates":10,"passed":7,"dropped":3,"minScore":60,"durationMs":3841}</w:t>
+      </w:r>
+    </w:p>
+    <w:p>
+      <w:pPr>
+        <w:shd w:fill="F3F3F3" w:color="auto" w:val="clear"/>
+        <w:spacing w:after="40"/>
+        <w:ind w:left="200"/>
+      </w:pPr>
+      <w:r>
+        <w:rPr>
+          <w:rFonts w:ascii="Consolas" w:cs="Consolas" w:eastAsia="Consolas" w:hAnsi="Consolas"/>
+          <w:sz w:val="18"/>
+          <w:szCs w:val="18"/>
+        </w:rPr>
+        <w:t xml:space="preserve">{"event":"batch_complete","batchIndex":1,"fetched":100,"savedWithEmail":7,"skippedUnverified":0,"leadsFetched":100,"leadsWithEmail":7,"lastPage":1,"totalPages":10,"unlockAttempts":</w:t>
+      </w:r>
+    </w:p>
+    <w:p>
+      <w:pPr>
+        <w:spacing w:after="80" w:before="0"/>
+      </w:pPr>
+      <w:r>
+        <w:rPr>
+          <w:rFonts w:ascii="Calibri" w:cs="Calibri" w:eastAsia="Calibri" w:hAnsi="Calibri"/>
+          <w:sz w:val="22"/>
+          <w:szCs w:val="22"/>
+        </w:rPr>
+        <w:t xml:space="preserve"/>
+      </w:r>
+    </w:p>
+    <w:p>
+      <w:pPr>
+        <w:pStyle w:val="Heading2"/>
+        <w:spacing w:after="120" w:before="240"/>
+      </w:pPr>
+      <w:bookmarkStart w:name="_Toc21" w:id="21"/>
+      <w:r>
+        <w:rPr>
+          <w:rFonts w:ascii="Calibri" w:cs="Calibri" w:eastAsia="Calibri" w:hAnsi="Calibri"/>
+          <w:b/>
+          <w:bCs/>
+          <w:color w:val="1F3A5F"/>
+          <w:sz w:val="26"/>
+          <w:szCs w:val="26"/>
+        </w:rPr>
+        <w:t xml:space="preserve">7.2 Credit measurement</w:t>
+      </w:r>
+      <w:bookmarkEnd w:id="21"/>
+    </w:p>
+    <w:p>
+      <w:pPr>
+        <w:shd w:fill="F3F3F3" w:color="auto" w:val="clear"/>
+        <w:spacing w:after="40"/>
+        <w:ind w:left="200"/>
+      </w:pPr>
+      <w:r>
+        <w:rPr>
+          <w:rFonts w:ascii="Consolas" w:cs="Consolas" w:eastAsia="Consolas" w:hAnsi="Consolas"/>
+          <w:sz w:val="18"/>
+          <w:szCs w:val="18"/>
+        </w:rPr>
+        <w:t xml:space="preserve">Apollo usage_stats/credit_usage_stats, lead_credit.consumed:</w:t>
+      </w:r>
+    </w:p>
+    <w:p>
+      <w:pPr>
+        <w:shd w:fill="F3F3F3" w:color="auto" w:val="clear"/>
+        <w:spacing w:after="40"/>
+        <w:ind w:left="200"/>
+      </w:pPr>
+      <w:r>
+        <w:rPr>
+          <w:rFonts w:ascii="Consolas" w:cs="Consolas" w:eastAsia="Consolas" w:hAnsi="Consolas"/>
+          <w:sz w:val="18"/>
+          <w:szCs w:val="18"/>
+        </w:rPr>
+        <w:t xml:space="preserve">  idle 40s before run:   +0   (45,373)</w:t>
+      </w:r>
+    </w:p>
+    <w:p>
+      <w:pPr>
+        <w:shd w:fill="F3F3F3" w:color="auto" w:val="clear"/>
+        <w:spacing w:after="40"/>
+        <w:ind w:left="200"/>
+      </w:pPr>
+      <w:r>
+        <w:rPr>
+          <w:rFonts w:ascii="Consolas" w:cs="Consolas" w:eastAsia="Consolas" w:hAnsi="Consolas"/>
+          <w:sz w:val="18"/>
+          <w:szCs w:val="18"/>
+        </w:rPr>
+        <w:t xml:space="preserve">  run:                   +10  (45,383)</w:t>
+      </w:r>
+    </w:p>
+    <w:p>
+      <w:pPr>
+        <w:shd w:fill="F3F3F3" w:color="auto" w:val="clear"/>
+        <w:spacing w:after="40"/>
+        <w:ind w:left="200"/>
+      </w:pPr>
+      <w:r>
+        <w:rPr>
+          <w:rFonts w:ascii="Consolas" w:cs="Consolas" w:eastAsia="Consolas" w:hAnsi="Consolas"/>
+          <w:sz w:val="18"/>
+          <w:szCs w:val="18"/>
+        </w:rPr>
+        <w:t xml:space="preserve">  idle 40s after run:    +0</w:t>
+      </w:r>
+    </w:p>
+    <w:p>
+      <w:pPr>
+        <w:shd w:fill="F3F3F3" w:color="auto" w:val="clear"/>
+        <w:spacing w:after="40"/>
+        <w:ind w:left="200"/>
+      </w:pPr>
+      <w:r>
+        <w:rPr>
+          <w:rFonts w:ascii="Consolas" w:cs="Consolas" w:eastAsia="Consolas" w:hAnsi="Consolas"/>
+          <w:sz w:val="18"/>
+          <w:szCs w:val="18"/>
+        </w:rPr>
+        <w:t xml:space="preserve">  app log unlockAttempts: 10, creditsPerSavedLead: 1.43</w:t>
+      </w:r>
+    </w:p>
+    <w:p>
+      <w:pPr>
+        <w:spacing w:after="80" w:before="0"/>
+      </w:pPr>
+      <w:r>
+        <w:rPr>
+          <w:rFonts w:ascii="Calibri" w:cs="Calibri" w:eastAsia="Calibri" w:hAnsi="Calibri"/>
+          <w:sz w:val="22"/>
+          <w:szCs w:val="22"/>
+        </w:rPr>
+        <w:t xml:space="preserve"/>
+      </w:r>
+    </w:p>
+    <w:p>
+      <w:pPr>
+        <w:pStyle w:val="Heading2"/>
+        <w:spacing w:after="120" w:before="240"/>
+      </w:pPr>
+      <w:bookmarkStart w:name="_Toc22" w:id="22"/>
+      <w:r>
+        <w:rPr>
+          <w:rFonts w:ascii="Calibri" w:cs="Calibri" w:eastAsia="Calibri" w:hAnsi="Calibri"/>
+          <w:b/>
+          <w:bCs/>
+          <w:color w:val="1F3A5F"/>
+          <w:sz w:val="26"/>
+          <w:szCs w:val="26"/>
+        </w:rPr>
+        <w:t xml:space="preserve">7.3 Independent audit call</w:t>
+      </w:r>
+      <w:bookmarkEnd w:id="22"/>
+    </w:p>
+    <w:p>
+      <w:pPr>
+        <w:shd w:fill="F3F3F3" w:color="auto" w:val="clear"/>
+        <w:spacing w:after="40"/>
+        <w:ind w:left="200"/>
+      </w:pPr>
+      <w:r>
+        <w:rPr>
+          <w:rFonts w:ascii="Consolas" w:cs="Consolas" w:eastAsia="Consolas" w:hAnsi="Consolas"/>
+          <w:sz w:val="18"/>
+          <w:szCs w:val="18"/>
+        </w:rPr>
+        <w:t xml:space="preserve">model: gpt-4o, temperature 0, JSON output</w:t>
+      </w:r>
+    </w:p>
+    <w:p>
+      <w:pPr>
+        <w:shd w:fill="F3F3F3" w:color="auto" w:val="clear"/>
+        <w:spacing w:after="40"/>
+        <w:ind w:left="200"/>
+      </w:pPr>
+      <w:r>
+        <w:rPr>
+          <w:rFonts w:ascii="Consolas" w:cs="Consolas" w:eastAsia="Consolas" w:hAnsi="Consolas"/>
+          <w:sz w:val="18"/>
+          <w:szCs w:val="18"/>
+        </w:rPr>
+        <w:t xml:space="preserve">system: "You are an independent auditor of B2B lead quality. You did not produce these leads..."</w:t>
+      </w:r>
+    </w:p>
+    <w:p>
+      <w:pPr>
+        <w:shd w:fill="F3F3F3" w:color="auto" w:val="clear"/>
+        <w:spacing w:after="40"/>
+        <w:ind w:left="200"/>
+      </w:pPr>
+      <w:r>
+        <w:rPr>
+          <w:rFonts w:ascii="Consolas" w:cs="Consolas" w:eastAsia="Consolas" w:hAnsi="Consolas"/>
+          <w:sz w:val="18"/>
+          <w:szCs w:val="18"/>
+        </w:rPr>
+        <w:t xml:space="preserve">input: the request + name, title, company, industry, employees, location for all 10 unlocked people</w:t>
+      </w:r>
+    </w:p>
+    <w:p>
+      <w:pPr>
+        <w:shd w:fill="F3F3F3" w:color="auto" w:val="clear"/>
+        <w:spacing w:after="40"/>
+        <w:ind w:left="200"/>
+      </w:pPr>
+      <w:r>
+        <w:rPr>
+          <w:rFonts w:ascii="Consolas" w:cs="Consolas" w:eastAsia="Consolas" w:hAnsi="Consolas"/>
+          <w:sz w:val="18"/>
+          <w:szCs w:val="18"/>
+        </w:rPr>
+        <w:t xml:space="preserve">output: role_fit, industry_fit, size_fit, location_fit, overall (good/borderline/bad), why</w:t>
+      </w:r>
+    </w:p>
+    <w:p>
+      <w:pPr>
+        <w:shd w:fill="F3F3F3" w:color="auto" w:val="clear"/>
+        <w:spacing w:after="40"/>
+        <w:ind w:left="200"/>
+      </w:pPr>
+      <w:r>
+        <w:rPr>
+          <w:rFonts w:ascii="Consolas" w:cs="Consolas" w:eastAsia="Consolas" w:hAnsi="Consolas"/>
+          <w:sz w:val="18"/>
+          <w:szCs w:val="18"/>
+        </w:rPr>
+        <w:t xml:space="preserve">tokens: 1,402 (about a tenth of a cent)</w:t>
+      </w:r>
+    </w:p>
+    <w:p>
+      <w:pPr>
+        <w:spacing w:after="80" w:before="0"/>
+      </w:pPr>
+      <w:r>
+        <w:rPr>
+          <w:rFonts w:ascii="Calibri" w:cs="Calibri" w:eastAsia="Calibri" w:hAnsi="Calibri"/>
+          <w:sz w:val="22"/>
+          <w:szCs w:val="22"/>
+        </w:rPr>
+        <w:t xml:space="preserve"/>
+      </w:r>
+    </w:p>
+    <w:p>
+      <w:pPr>
+        <w:spacing w:after="60" w:before="120"/>
+        <w:jc w:val="center"/>
+      </w:pPr>
+      <w:r>
+        <w:drawing>
+          <wp:inline distT="0" distB="0" distL="0" distR="0">
+            <wp:extent cx="5524500" cy="5753100"/>
+            <wp:effectExtent t="0" r="0" b="0" l="0"/>
+            <wp:docPr id="5" name=""/>
+            <wp:cNvGraphicFramePr>
+              <a:graphicFrameLocks xmlns:a="http://schemas.openxmlformats.org/drawingml/2006/main" noChangeAspect="1"/>
+            </wp:cNvGraphicFramePr>
+            <a:graphic xmlns:a="http://schemas.openxmlformats.org/drawingml/2006/main">
+              <a:graphicData uri="http://schemas.openxmlformats.org/drawingml/2006/picture">
+                <pic:pic xmlns:pic="http://schemas.openxmlformats.org/drawingml/2006/picture">
+                  <pic:nvPicPr>
+                    <pic:cNvPr id="0" name="" descr=""/>
+                    <pic:cNvPicPr>
+                      <a:picLocks noChangeAspect="1" noChangeArrowheads="1"/>
+                    </pic:cNvPicPr>
+                  </pic:nvPicPr>
+                  <pic:blipFill>
+                    <a:blip r:embed="rId13" cstate="none"/>
+                    <a:srcRect/>
+                    <a:stretch>
+                      <a:fillRect/>
+                    </a:stretch>
+                  </pic:blipFill>
+                  <pic:spPr bwMode="auto">
+                    <a:xfrm>
+                      <a:off x="0" y="0"/>
                       <a:ext cx="5524500" cy="5753100"/>
                     </a:xfrm>
                     <a:prstGeom prst="rect">
@@ -9902,7 +11642,7 @@
         <w:pStyle w:val="Heading2"/>
         <w:spacing w:after="120" w:before="240"/>
       </w:pPr>
-      <w:bookmarkStart w:name="_Toc19" w:id="19"/>
+      <w:bookmarkStart w:name="_Toc23" w:id="23"/>
       <w:r>
         <w:rPr>
           <w:rFonts w:ascii="Calibri" w:cs="Calibri" w:eastAsia="Calibri" w:hAnsi="Calibri"/>
@@ -9914,7 +11654,7 @@
         </w:rPr>
         <w:t xml:space="preserve">7.4 Files</w:t>
       </w:r>
-      <w:bookmarkEnd w:id="19"/>
+      <w:bookmarkEnd w:id="23"/>
     </w:p>
     <w:tbl>
       <w:tblPr>

</xml_diff>